<commit_message>
Rewrite report objective and measurement framework
Corrects the executive summary to lead with the stated business
objective — week-on-week stock and sales view as a central management
system — and replaces the tab-centric framing with the correct
measurement model: three inputs (sales, deliveries, physical stock)
producing four non-overlapping outputs.

https://claude.ai/code/session_01UtKqVKtqBi8bhP2Mmgw7Cb
</commit_message>
<xml_diff>
--- a/shop-dashboard-redesign-report.docx
+++ b/shop-dashboard-redesign-report.docx
@@ -148,31 +148,6 @@
           <w:sz w:val="20"/>
         </w:rPr>
         <w:t>1. EXECUTIVE SUMMARY</w:t>
-      </w:r>
-    </w:p>
-    <w:p>
-      <w:pPr>
-        <w:spacing w:after="120"/>
-      </w:pPr>
-      <w:r>
-        <w:rPr>
-          <w:color w:val="444444"/>
-          <w:sz w:val="21"/>
-        </w:rPr>
-        <w:t>ONE LDN operates a café and merchandise shop at its gym facility. Sales are processed through WodBoard and tracked manually via CSV upload into a custom Supabase-backed dashboard. This report documents the planning and rationale behind a structural redesign of that dashboard — from a five-tab layout that had grown organically over time into a purposeful four-tab system built around four operational questions: what sold, what we have, what needs ordering, and how we are performing financially.</w:t>
-      </w:r>
-    </w:p>
-    <w:p>
-      <w:pPr>
-        <w:spacing w:before="240" w:after="80"/>
-      </w:pPr>
-      <w:r>
-        <w:rPr>
-          <w:b/>
-          <w:color w:val="444444"/>
-          <w:sz w:val="22"/>
-        </w:rPr>
-        <w:t>Objective</w:t>
       </w:r>
     </w:p>
     <w:tbl>
@@ -205,7 +180,7 @@
                 <w:color w:val="444444"/>
                 <w:sz w:val="20"/>
               </w:rPr>
-              <w:t>To redesign the shop sales dashboard so that each section answers a single, clearly-defined question for a decision maker — eliminating overlap, surfacing the most operationally relevant signals on the default view, and providing a foundation for physical stock reconciliation that the business has needed from the start.</w:t>
+              <w:t>The ONE LDN shop sales dashboard will provide a week-on-week view of stock levels and sales, serving as the central management system and reporting tool for all shop sales activity.</w:t>
             </w:r>
           </w:p>
         </w:tc>
@@ -225,12 +200,12 @@
           <w:color w:val="444444"/>
           <w:sz w:val="21"/>
         </w:rPr>
-        <w:t>The redesign was informed by a review of the metrics used by best-in-class inventory management systems, mapped against the specific operational context of a single-site gym shop with two distinct product types: high-frequency café consumables on a fortnightly order cycle, and longer-lead-time merchandise on an eight-week cycle.</w:t>
+        <w:t>ONE LDN operates a café and a merchandise shop within the gym. Sales are processed through WodBoard; stock arrives via supplier deliveries logged by PDF invoice or manual entry. This report documents the planning and design of a dashboard that gives management a single, reliable place to answer every operational question about the shop — without duplicating information or requiring data to be tracked in more than one place.</w:t>
       </w:r>
     </w:p>
     <w:p>
       <w:pPr>
-        <w:spacing w:before="240" w:after="80"/>
+        <w:spacing w:before="280" w:after="80"/>
       </w:pPr>
       <w:r>
         <w:rPr>
@@ -238,322 +213,19 @@
           <w:color w:val="444444"/>
           <w:sz w:val="22"/>
         </w:rPr>
-        <w:t>Key Outcomes</w:t>
+        <w:t>What We Measure</w:t>
       </w:r>
     </w:p>
     <w:p>
       <w:pPr>
-        <w:pStyle w:val="ListBullet"/>
-        <w:spacing w:after="60"/>
-        <w:ind w:left="340"/>
-      </w:pPr>
-      <w:r>
-        <w:rPr>
-          <w:b/>
-          <w:color w:val="111111"/>
-          <w:sz w:val="21"/>
-        </w:rPr>
-        <w:t xml:space="preserve">Tab count reduced from 5 to 4. </w:t>
-      </w:r>
+        <w:spacing w:after="120"/>
+      </w:pPr>
       <w:r>
         <w:rPr>
           <w:color w:val="444444"/>
           <w:sz w:val="21"/>
         </w:rPr>
-        <w:t>Overlap between the old Overview and Top Sellers tabs is eliminated.</w:t>
-      </w:r>
-    </w:p>
-    <w:p>
-      <w:pPr>
-        <w:pStyle w:val="ListBullet"/>
-        <w:spacing w:after="60"/>
-        <w:ind w:left="340"/>
-      </w:pPr>
-      <w:r>
-        <w:rPr>
-          <w:b/>
-          <w:color w:val="111111"/>
-          <w:sz w:val="21"/>
-        </w:rPr>
-        <w:t xml:space="preserve">A default weekly report view. </w:t>
-      </w:r>
-      <w:r>
-        <w:rPr>
-          <w:color w:val="444444"/>
-          <w:sz w:val="21"/>
-        </w:rPr>
-        <w:t>The landing screen now answers "what sold this week?" with week-on-week comparisons, replacing a static all-time summary.</w:t>
-      </w:r>
-    </w:p>
-    <w:p>
-      <w:pPr>
-        <w:pStyle w:val="ListBullet"/>
-        <w:spacing w:after="60"/>
-        <w:ind w:left="340"/>
-      </w:pPr>
-      <w:r>
-        <w:rPr>
-          <w:b/>
-          <w:color w:val="111111"/>
-          <w:sz w:val="21"/>
-        </w:rPr>
-        <w:t xml:space="preserve">Stock reconciliation introduced. </w:t>
-      </w:r>
-      <w:r>
-        <w:rPr>
-          <w:color w:val="444444"/>
-          <w:sz w:val="21"/>
-        </w:rPr>
-        <w:t>A new tab connects physical counts to the theoretical stock chain — a database table (shop_stock_takes) for this purpose already existed but had never been connected to the UI.</w:t>
-      </w:r>
-    </w:p>
-    <w:p>
-      <w:pPr>
-        <w:pStyle w:val="ListBullet"/>
-        <w:spacing w:after="60"/>
-        <w:ind w:left="340"/>
-      </w:pPr>
-      <w:r>
-        <w:rPr>
-          <w:b/>
-          <w:color w:val="111111"/>
-          <w:sz w:val="21"/>
-        </w:rPr>
-        <w:t xml:space="preserve">Finance consolidated. </w:t>
-      </w:r>
-      <w:r>
-        <w:rPr>
-          <w:color w:val="444444"/>
-          <w:sz w:val="21"/>
-        </w:rPr>
-        <w:t>Revenue trend charts and gross profit data previously split across two tabs are merged into a single monthly-review view.</w:t>
-      </w:r>
-    </w:p>
-    <w:p>
-      <w:pPr>
-        <w:pStyle w:val="ListBullet"/>
-        <w:spacing w:after="60"/>
-        <w:ind w:left="340"/>
-      </w:pPr>
-      <w:r>
-        <w:rPr>
-          <w:b/>
-          <w:color w:val="111111"/>
-          <w:sz w:val="21"/>
-        </w:rPr>
-        <w:t xml:space="preserve">Health visibility on the primary screen. </w:t>
-      </w:r>
-      <w:r>
-        <w:rPr>
-          <w:color w:val="444444"/>
-          <w:sz w:val="21"/>
-        </w:rPr>
-        <w:t>Stock urgency counts (Order Now / Order Soon / Healthy / Excess) and days-of-stock-remaining per product are visible on the default tab, removing the need to navigate away for a stock health check.</w:t>
-      </w:r>
-    </w:p>
-    <w:p/>
-    <w:p>
-      <w:pPr>
-        <w:spacing w:before="360" w:after="160"/>
-        <w:pBdr>
-          <w:bottom w:val="single" w:sz="4" w:space="4" w:color="CCCCCC"/>
-        </w:pBdr>
-      </w:pPr>
-      <w:r>
-        <w:rPr>
-          <w:b/>
-          <w:caps/>
-          <w:color w:val="888888"/>
-          <w:sz w:val="20"/>
-        </w:rPr>
-        <w:t>2. BACKGROUND</w:t>
-      </w:r>
-    </w:p>
-    <w:p>
-      <w:pPr>
-        <w:spacing w:before="200" w:after="120"/>
-      </w:pPr>
-      <w:r>
-        <w:rPr>
-          <w:b/>
-          <w:color w:val="111111"/>
-          <w:sz w:val="26"/>
-        </w:rPr>
-        <w:t>The Business Context</w:t>
-      </w:r>
-    </w:p>
-    <w:p>
-      <w:pPr>
-        <w:spacing w:after="120"/>
-      </w:pPr>
-      <w:r>
-        <w:rPr>
-          <w:color w:val="444444"/>
-          <w:sz w:val="21"/>
-        </w:rPr>
-        <w:t>ONE LDN's shop covers two distinct trading areas: a café operation selling coffees, protein shakes, energy drinks, and snack bars; and a merchandise range including branded apparel and accessories. The two categories have meaningfully different inventory dynamics — café products turn over weekly and are ordered on a rolling two-week cycle from suppliers such as Muscle Finesse, while merchandise carries longer lead times and is ordered on an eight-week cycle from suppliers including Tapstitch.</w:t>
-      </w:r>
-    </w:p>
-    <w:p>
-      <w:pPr>
-        <w:spacing w:after="120"/>
-      </w:pPr>
-      <w:r>
-        <w:rPr>
-          <w:color w:val="444444"/>
-          <w:sz w:val="21"/>
-        </w:rPr>
-        <w:t>Sales are processed through WodBoard and exported weekly as a CSV file. Deliveries are logged either manually or by uploading supplier PDF invoices, which the system parses automatically. All data is stored in Supabase.</w:t>
-      </w:r>
-    </w:p>
-    <w:p>
-      <w:pPr>
-        <w:spacing w:before="200" w:after="120"/>
-      </w:pPr>
-      <w:r>
-        <w:rPr>
-          <w:b/>
-          <w:color w:val="111111"/>
-          <w:sz w:val="26"/>
-        </w:rPr>
-        <w:t>Why a Redesign Was Needed</w:t>
-      </w:r>
-    </w:p>
-    <w:p>
-      <w:pPr>
-        <w:spacing w:after="120"/>
-      </w:pPr>
-      <w:r>
-        <w:rPr>
-          <w:color w:val="444444"/>
-          <w:sz w:val="21"/>
-        </w:rPr>
-        <w:t>The original dashboard was built incrementally, with each new requirement added as an additional tab or element. Over time this produced five tabs with overlapping content, unclear primary actions, and a default view that did not reflect the most common reason for opening the dashboard — understanding the current week's trading and stock position.</w:t>
-      </w:r>
-    </w:p>
-    <w:p>
-      <w:pPr>
-        <w:spacing w:after="120"/>
-      </w:pPr>
-      <w:r>
-        <w:rPr>
-          <w:color w:val="444444"/>
-          <w:sz w:val="21"/>
-        </w:rPr>
-        <w:t>Specific structural problems identified in the previous design:</w:t>
-      </w:r>
-    </w:p>
-    <w:p>
-      <w:pPr>
-        <w:pStyle w:val="ListBullet"/>
-        <w:spacing w:after="60"/>
-        <w:ind w:left="340"/>
-      </w:pPr>
-      <w:r>
-        <w:rPr>
-          <w:color w:val="444444"/>
-          <w:sz w:val="21"/>
-        </w:rPr>
-        <w:t>Overview and Top Sellers both answered variations of "what is selling?" in different formats, requiring users to visit two tabs for the same question.</w:t>
-      </w:r>
-    </w:p>
-    <w:p>
-      <w:pPr>
-        <w:pStyle w:val="ListBullet"/>
-        <w:spacing w:after="60"/>
-        <w:ind w:left="340"/>
-      </w:pPr>
-      <w:r>
-        <w:rPr>
-          <w:color w:val="444444"/>
-          <w:sz w:val="21"/>
-        </w:rPr>
-        <w:t>Stock History served two audiences simultaneously: operational stock reconciliation (delivery vs sold) and financial margin review (GP%), which belong in different contexts.</w:t>
-      </w:r>
-    </w:p>
-    <w:p>
-      <w:pPr>
-        <w:pStyle w:val="ListBullet"/>
-        <w:spacing w:after="60"/>
-        <w:ind w:left="340"/>
-      </w:pPr>
-      <w:r>
-        <w:rPr>
-          <w:color w:val="444444"/>
-          <w:sz w:val="21"/>
-        </w:rPr>
-        <w:t>The default Overview tab displayed metrics (all-time top products, revenue chart, category donut) that were useful for orientation but not for daily or weekly operational decisions.</w:t>
-      </w:r>
-    </w:p>
-    <w:p>
-      <w:pPr>
-        <w:pStyle w:val="ListBullet"/>
-        <w:spacing w:after="60"/>
-        <w:ind w:left="340"/>
-      </w:pPr>
-      <w:r>
-        <w:rPr>
-          <w:color w:val="444444"/>
-          <w:sz w:val="21"/>
-        </w:rPr>
-        <w:t>No physical stock count workflow existed in the UI, despite a purpose-built database table (shop_stock_takes) already being available in Supabase.</w:t>
-      </w:r>
-    </w:p>
-    <w:p>
-      <w:pPr>
-        <w:pStyle w:val="ListBullet"/>
-        <w:spacing w:after="60"/>
-        <w:ind w:left="340"/>
-      </w:pPr>
-      <w:r>
-        <w:rPr>
-          <w:color w:val="444444"/>
-          <w:sz w:val="21"/>
-        </w:rPr>
-        <w:t>Stock health status — days of stock remaining, urgency flags — was only visible inside the Order Prediction tab, requiring navigation away from the primary view to assess the situation.</w:t>
-      </w:r>
-    </w:p>
-    <w:p/>
-    <w:p>
-      <w:pPr>
-        <w:spacing w:before="360" w:after="160"/>
-        <w:pBdr>
-          <w:bottom w:val="single" w:sz="4" w:space="4" w:color="CCCCCC"/>
-        </w:pBdr>
-      </w:pPr>
-      <w:r>
-        <w:rPr>
-          <w:b/>
-          <w:caps/>
-          <w:color w:val="888888"/>
-          <w:sz w:val="20"/>
-        </w:rPr>
-        <w:t>3. RESEARCH AND BENCHMARK CRITERIA</w:t>
-      </w:r>
-    </w:p>
-    <w:p>
-      <w:pPr>
-        <w:spacing w:after="120"/>
-      </w:pPr>
-      <w:r>
-        <w:rPr>
-          <w:color w:val="444444"/>
-          <w:sz w:val="21"/>
-        </w:rPr>
-        <w:t>Before planning the redesign, the most useful metrics in best-in-class inventory management systems were identified. These formed the evaluation criteria for both the existing dashboard and the proposed new structure.</w:t>
-      </w:r>
-    </w:p>
-    <w:p>
-      <w:pPr>
-        <w:spacing w:before="200" w:after="120"/>
-      </w:pPr>
-      <w:r>
-        <w:rPr>
-          <w:b/>
-          <w:color w:val="111111"/>
-          <w:sz w:val="26"/>
-        </w:rPr>
-        <w:t>Industry Benchmark Metrics</w:t>
+        <w:t>Three inputs drive everything in the dashboard:</w:t>
       </w:r>
     </w:p>
     <w:tbl>
@@ -571,7 +243,7 @@
       <w:tr>
         <w:tc>
           <w:tcPr>
-            <w:tcW w:type="dxa" w:w="4535"/>
+            <w:tcW w:type="dxa" w:w="1984"/>
             <w:shd w:val="clear" w:color="auto" w:fill="111111"/>
           </w:tcPr>
           <w:p>
@@ -584,26 +256,7 @@
                 <w:color w:val="FFFFFF"/>
                 <w:sz w:val="18"/>
               </w:rPr>
-              <w:t>METRIC</w:t>
-            </w:r>
-          </w:p>
-        </w:tc>
-        <w:tc>
-          <w:tcPr>
-            <w:tcW w:type="dxa" w:w="1417"/>
-            <w:shd w:val="clear" w:color="auto" w:fill="111111"/>
-          </w:tcPr>
-          <w:p>
-            <w:pPr>
-              <w:spacing w:before="80" w:after="80"/>
-            </w:pPr>
-            <w:r>
-              <w:rPr>
-                <w:b/>
-                <w:color w:val="FFFFFF"/>
-                <w:sz w:val="18"/>
-              </w:rPr>
-              <w:t>PRIORITY</w:t>
+              <w:t>INPUT</w:t>
             </w:r>
           </w:p>
         </w:tc>
@@ -622,7 +275,26 @@
                 <w:color w:val="FFFFFF"/>
                 <w:sz w:val="18"/>
               </w:rPr>
-              <w:t>NOTES</w:t>
+              <w:t>SOURCE</w:t>
+            </w:r>
+          </w:p>
+        </w:tc>
+        <w:tc>
+          <w:tcPr>
+            <w:tcW w:type="dxa" w:w="3969"/>
+            <w:shd w:val="clear" w:color="auto" w:fill="111111"/>
+          </w:tcPr>
+          <w:p>
+            <w:pPr>
+              <w:spacing w:before="80" w:after="80"/>
+            </w:pPr>
+            <w:r>
+              <w:rPr>
+                <w:b/>
+                <w:color w:val="FFFFFF"/>
+                <w:sz w:val="18"/>
+              </w:rPr>
+              <w:t>WHAT IT ENABLES</w:t>
             </w:r>
           </w:p>
         </w:tc>
@@ -630,7 +302,7 @@
       <w:tr>
         <w:tc>
           <w:tcPr>
-            <w:tcW w:type="dxa" w:w="4535"/>
+            <w:tcW w:type="dxa" w:w="1984"/>
             <w:shd w:val="clear" w:color="auto" w:fill="FFFFFF"/>
           </w:tcPr>
           <w:p>
@@ -642,25 +314,7 @@
                 <w:color w:val="444444"/>
                 <w:sz w:val="19"/>
               </w:rPr>
-              <w:t>Top-selling products and categories</w:t>
-            </w:r>
-          </w:p>
-        </w:tc>
-        <w:tc>
-          <w:tcPr>
-            <w:tcW w:type="dxa" w:w="1417"/>
-            <w:shd w:val="clear" w:color="auto" w:fill="FFFFFF"/>
-          </w:tcPr>
-          <w:p>
-            <w:pPr>
-              <w:spacing w:before="60" w:after="60"/>
-            </w:pPr>
-            <w:r>
-              <w:rPr>
-                <w:color w:val="444444"/>
-                <w:sz w:val="19"/>
-              </w:rPr>
-              <w:t>Core</w:t>
+              <w:t>Total sales</w:t>
             </w:r>
           </w:p>
         </w:tc>
@@ -678,7 +332,25 @@
                 <w:color w:val="444444"/>
                 <w:sz w:val="19"/>
               </w:rPr>
-              <w:t>By units and revenue, with period comparison</w:t>
+              <w:t>WodBoard CSV — uploaded weekly</w:t>
+            </w:r>
+          </w:p>
+        </w:tc>
+        <w:tc>
+          <w:tcPr>
+            <w:tcW w:type="dxa" w:w="3969"/>
+            <w:shd w:val="clear" w:color="auto" w:fill="FFFFFF"/>
+          </w:tcPr>
+          <w:p>
+            <w:pPr>
+              <w:spacing w:before="60" w:after="60"/>
+            </w:pPr>
+            <w:r>
+              <w:rPr>
+                <w:color w:val="444444"/>
+                <w:sz w:val="19"/>
+              </w:rPr>
+              <w:t>What sold, revenue, velocity, reorder triggers</w:t>
             </w:r>
           </w:p>
         </w:tc>
@@ -686,7 +358,7 @@
       <w:tr>
         <w:tc>
           <w:tcPr>
-            <w:tcW w:type="dxa" w:w="4535"/>
+            <w:tcW w:type="dxa" w:w="1984"/>
             <w:shd w:val="clear" w:color="auto" w:fill="F7F7F7"/>
           </w:tcPr>
           <w:p>
@@ -698,25 +370,7 @@
                 <w:color w:val="444444"/>
                 <w:sz w:val="19"/>
               </w:rPr>
-              <w:t>Sell-through rate</w:t>
-            </w:r>
-          </w:p>
-        </w:tc>
-        <w:tc>
-          <w:tcPr>
-            <w:tcW w:type="dxa" w:w="1417"/>
-            <w:shd w:val="clear" w:color="auto" w:fill="F7F7F7"/>
-          </w:tcPr>
-          <w:p>
-            <w:pPr>
-              <w:spacing w:before="60" w:after="60"/>
-            </w:pPr>
-            <w:r>
-              <w:rPr>
-                <w:color w:val="444444"/>
-                <w:sz w:val="19"/>
-              </w:rPr>
-              <w:t>Core</w:t>
+              <w:t>Total deliveries</w:t>
             </w:r>
           </w:p>
         </w:tc>
@@ -734,7 +388,25 @@
                 <w:color w:val="444444"/>
                 <w:sz w:val="19"/>
               </w:rPr>
-              <w:t>Units sold ÷ (delivered + opening stock)</w:t>
+              <w:t>Supplier invoices (PDF or manual entry)</w:t>
+            </w:r>
+          </w:p>
+        </w:tc>
+        <w:tc>
+          <w:tcPr>
+            <w:tcW w:type="dxa" w:w="3969"/>
+            <w:shd w:val="clear" w:color="auto" w:fill="F7F7F7"/>
+          </w:tcPr>
+          <w:p>
+            <w:pPr>
+              <w:spacing w:before="60" w:after="60"/>
+            </w:pPr>
+            <w:r>
+              <w:rPr>
+                <w:color w:val="444444"/>
+                <w:sz w:val="19"/>
+              </w:rPr>
+              <w:t>Stock received, COGS, reconciliation opening balance</w:t>
             </w:r>
           </w:p>
         </w:tc>
@@ -742,7 +414,7 @@
       <w:tr>
         <w:tc>
           <w:tcPr>
-            <w:tcW w:type="dxa" w:w="4535"/>
+            <w:tcW w:type="dxa" w:w="1984"/>
             <w:shd w:val="clear" w:color="auto" w:fill="FFFFFF"/>
           </w:tcPr>
           <w:p>
@@ -754,25 +426,7 @@
                 <w:color w:val="444444"/>
                 <w:sz w:val="19"/>
               </w:rPr>
-              <w:t>Days of inventory remaining</w:t>
-            </w:r>
-          </w:p>
-        </w:tc>
-        <w:tc>
-          <w:tcPr>
-            <w:tcW w:type="dxa" w:w="1417"/>
-            <w:shd w:val="clear" w:color="auto" w:fill="FFFFFF"/>
-          </w:tcPr>
-          <w:p>
-            <w:pPr>
-              <w:spacing w:before="60" w:after="60"/>
-            </w:pPr>
-            <w:r>
-              <w:rPr>
-                <w:color w:val="444444"/>
-                <w:sz w:val="19"/>
-              </w:rPr>
-              <w:t>Core</w:t>
+              <w:t>Total stock</w:t>
             </w:r>
           </w:p>
         </w:tc>
@@ -790,7 +444,127 @@
                 <w:color w:val="444444"/>
                 <w:sz w:val="19"/>
               </w:rPr>
-              <w:t>Stock ÷ weekly velocity</w:t>
+              <w:t>Physical count entered in the dashboard</w:t>
+            </w:r>
+          </w:p>
+        </w:tc>
+        <w:tc>
+          <w:tcPr>
+            <w:tcW w:type="dxa" w:w="3969"/>
+            <w:shd w:val="clear" w:color="auto" w:fill="FFFFFF"/>
+          </w:tcPr>
+          <w:p>
+            <w:pPr>
+              <w:spacing w:before="60" w:after="60"/>
+            </w:pPr>
+            <w:r>
+              <w:rPr>
+                <w:color w:val="444444"/>
+                <w:sz w:val="19"/>
+              </w:rPr>
+              <w:t>Actual vs theoretical variance, accurate reorder baseline</w:t>
+            </w:r>
+          </w:p>
+        </w:tc>
+      </w:tr>
+    </w:tbl>
+    <w:p>
+      <w:pPr>
+        <w:spacing w:after="40"/>
+      </w:pPr>
+    </w:p>
+    <w:p>
+      <w:pPr>
+        <w:spacing w:before="280" w:after="80"/>
+      </w:pPr>
+      <w:r>
+        <w:rPr>
+          <w:b/>
+          <w:color w:val="444444"/>
+          <w:sz w:val="22"/>
+        </w:rPr>
+        <w:t>What the Dashboard Outputs</w:t>
+      </w:r>
+    </w:p>
+    <w:p>
+      <w:pPr>
+        <w:spacing w:after="120"/>
+      </w:pPr>
+      <w:r>
+        <w:rPr>
+          <w:color w:val="444444"/>
+          <w:sz w:val="21"/>
+        </w:rPr>
+        <w:t>From those three inputs, the dashboard produces four outputs — one per tab — with no overlap between them. Each tab answers exactly one question:</w:t>
+      </w:r>
+    </w:p>
+    <w:tbl>
+      <w:tblPr>
+        <w:tblStyle w:val="TableGrid"/>
+        <w:tblW w:type="auto" w:w="0"/>
+        <w:jc w:val="left"/>
+        <w:tblLook w:firstColumn="1" w:firstRow="1" w:lastColumn="0" w:lastRow="0" w:noHBand="0" w:noVBand="1" w:val="04A0"/>
+      </w:tblPr>
+      <w:tblGrid>
+        <w:gridCol w:w="3041"/>
+        <w:gridCol w:w="3041"/>
+        <w:gridCol w:w="3041"/>
+      </w:tblGrid>
+      <w:tr>
+        <w:tc>
+          <w:tcPr>
+            <w:tcW w:type="dxa" w:w="2268"/>
+            <w:shd w:val="clear" w:color="auto" w:fill="111111"/>
+          </w:tcPr>
+          <w:p>
+            <w:pPr>
+              <w:spacing w:before="80" w:after="80"/>
+            </w:pPr>
+            <w:r>
+              <w:rPr>
+                <w:b/>
+                <w:color w:val="FFFFFF"/>
+                <w:sz w:val="18"/>
+              </w:rPr>
+              <w:t>TAB</w:t>
+            </w:r>
+          </w:p>
+        </w:tc>
+        <w:tc>
+          <w:tcPr>
+            <w:tcW w:type="dxa" w:w="2551"/>
+            <w:shd w:val="clear" w:color="auto" w:fill="111111"/>
+          </w:tcPr>
+          <w:p>
+            <w:pPr>
+              <w:spacing w:before="80" w:after="80"/>
+            </w:pPr>
+            <w:r>
+              <w:rPr>
+                <w:b/>
+                <w:color w:val="FFFFFF"/>
+                <w:sz w:val="18"/>
+              </w:rPr>
+              <w:t>QUESTION</w:t>
+            </w:r>
+          </w:p>
+        </w:tc>
+        <w:tc>
+          <w:tcPr>
+            <w:tcW w:type="dxa" w:w="4252"/>
+            <w:shd w:val="clear" w:color="auto" w:fill="111111"/>
+          </w:tcPr>
+          <w:p>
+            <w:pPr>
+              <w:spacing w:before="80" w:after="80"/>
+            </w:pPr>
+            <w:r>
+              <w:rPr>
+                <w:b/>
+                <w:color w:val="FFFFFF"/>
+                <w:sz w:val="18"/>
+              </w:rPr>
+              <w:t>OUTCOME FOR THE BUSINESS</w:t>
             </w:r>
           </w:p>
         </w:tc>
@@ -798,7 +572,63 @@
       <w:tr>
         <w:tc>
           <w:tcPr>
-            <w:tcW w:type="dxa" w:w="4535"/>
+            <w:tcW w:type="dxa" w:w="2268"/>
+            <w:shd w:val="clear" w:color="auto" w:fill="FFFFFF"/>
+          </w:tcPr>
+          <w:p>
+            <w:pPr>
+              <w:spacing w:before="60" w:after="60"/>
+            </w:pPr>
+            <w:r>
+              <w:rPr>
+                <w:color w:val="444444"/>
+                <w:sz w:val="19"/>
+              </w:rPr>
+              <w:t>Weekly Report</w:t>
+            </w:r>
+          </w:p>
+        </w:tc>
+        <w:tc>
+          <w:tcPr>
+            <w:tcW w:type="dxa" w:w="2551"/>
+            <w:shd w:val="clear" w:color="auto" w:fill="FFFFFF"/>
+          </w:tcPr>
+          <w:p>
+            <w:pPr>
+              <w:spacing w:before="60" w:after="60"/>
+            </w:pPr>
+            <w:r>
+              <w:rPr>
+                <w:color w:val="444444"/>
+                <w:sz w:val="19"/>
+              </w:rPr>
+              <w:t>What sold?</w:t>
+            </w:r>
+          </w:p>
+        </w:tc>
+        <w:tc>
+          <w:tcPr>
+            <w:tcW w:type="dxa" w:w="4252"/>
+            <w:shd w:val="clear" w:color="auto" w:fill="FFFFFF"/>
+          </w:tcPr>
+          <w:p>
+            <w:pPr>
+              <w:spacing w:before="60" w:after="60"/>
+            </w:pPr>
+            <w:r>
+              <w:rPr>
+                <w:color w:val="444444"/>
+                <w:sz w:val="19"/>
+              </w:rPr>
+              <w:t>Week-on-week sales by product and category; stock health at a glance</w:t>
+            </w:r>
+          </w:p>
+        </w:tc>
+      </w:tr>
+      <w:tr>
+        <w:tc>
+          <w:tcPr>
+            <w:tcW w:type="dxa" w:w="2268"/>
             <w:shd w:val="clear" w:color="auto" w:fill="F7F7F7"/>
           </w:tcPr>
           <w:p>
@@ -810,13 +640,13 @@
                 <w:color w:val="444444"/>
                 <w:sz w:val="19"/>
               </w:rPr>
-              <w:t>Stock health flags — at-risk, healthy, overstocked</w:t>
+              <w:t>Stock Reconciliation</w:t>
             </w:r>
           </w:p>
         </w:tc>
         <w:tc>
           <w:tcPr>
-            <w:tcW w:type="dxa" w:w="1417"/>
+            <w:tcW w:type="dxa" w:w="2551"/>
             <w:shd w:val="clear" w:color="auto" w:fill="F7F7F7"/>
           </w:tcPr>
           <w:p>
@@ -828,13 +658,13 @@
                 <w:color w:val="444444"/>
                 <w:sz w:val="19"/>
               </w:rPr>
-              <w:t>Core</w:t>
+              <w:t>What do we have?</w:t>
             </w:r>
           </w:p>
         </w:tc>
         <w:tc>
           <w:tcPr>
-            <w:tcW w:type="dxa" w:w="3118"/>
+            <w:tcW w:type="dxa" w:w="4252"/>
             <w:shd w:val="clear" w:color="auto" w:fill="F7F7F7"/>
           </w:tcPr>
           <w:p>
@@ -846,7 +676,7 @@
                 <w:color w:val="444444"/>
                 <w:sz w:val="19"/>
               </w:rPr>
-              <w:t>Three-tier classification</w:t>
+              <w:t>Physical stock vs theoretical; variance tracking; accurate reorder baseline</w:t>
             </w:r>
           </w:p>
         </w:tc>
@@ -854,7 +684,7 @@
       <w:tr>
         <w:tc>
           <w:tcPr>
-            <w:tcW w:type="dxa" w:w="4535"/>
+            <w:tcW w:type="dxa" w:w="2268"/>
             <w:shd w:val="clear" w:color="auto" w:fill="FFFFFF"/>
           </w:tcPr>
           <w:p>
@@ -866,13 +696,13 @@
                 <w:color w:val="444444"/>
                 <w:sz w:val="19"/>
               </w:rPr>
-              <w:t>Revenue by week and month</w:t>
+              <w:t>Order Prediction</w:t>
             </w:r>
           </w:p>
         </w:tc>
         <w:tc>
           <w:tcPr>
-            <w:tcW w:type="dxa" w:w="1417"/>
+            <w:tcW w:type="dxa" w:w="2551"/>
             <w:shd w:val="clear" w:color="auto" w:fill="FFFFFF"/>
           </w:tcPr>
           <w:p>
@@ -884,13 +714,13 @@
                 <w:color w:val="444444"/>
                 <w:sz w:val="19"/>
               </w:rPr>
-              <w:t>Core</w:t>
+              <w:t>What needs reordering?</w:t>
             </w:r>
           </w:p>
         </w:tc>
         <w:tc>
           <w:tcPr>
-            <w:tcW w:type="dxa" w:w="3118"/>
+            <w:tcW w:type="dxa" w:w="4252"/>
             <w:shd w:val="clear" w:color="auto" w:fill="FFFFFF"/>
           </w:tcPr>
           <w:p>
@@ -902,7 +732,7 @@
                 <w:color w:val="444444"/>
                 <w:sz w:val="19"/>
               </w:rPr>
-              <w:t>Trend view over time</w:t>
+              <w:t>Velocity-driven days-of-stock and suggested order quantities per product</w:t>
             </w:r>
           </w:p>
         </w:tc>
@@ -910,7 +740,7 @@
       <w:tr>
         <w:tc>
           <w:tcPr>
-            <w:tcW w:type="dxa" w:w="4535"/>
+            <w:tcW w:type="dxa" w:w="2268"/>
             <w:shd w:val="clear" w:color="auto" w:fill="F7F7F7"/>
           </w:tcPr>
           <w:p>
@@ -922,13 +752,13 @@
                 <w:color w:val="444444"/>
                 <w:sz w:val="19"/>
               </w:rPr>
-              <w:t>Fastest and slowest moving items</w:t>
+              <w:t>Finance</w:t>
             </w:r>
           </w:p>
         </w:tc>
         <w:tc>
           <w:tcPr>
-            <w:tcW w:type="dxa" w:w="1417"/>
+            <w:tcW w:type="dxa" w:w="2551"/>
             <w:shd w:val="clear" w:color="auto" w:fill="F7F7F7"/>
           </w:tcPr>
           <w:p>
@@ -940,13 +770,13 @@
                 <w:color w:val="444444"/>
                 <w:sz w:val="19"/>
               </w:rPr>
-              <w:t>High</w:t>
+              <w:t>How are we performing?</w:t>
             </w:r>
           </w:p>
         </w:tc>
         <w:tc>
           <w:tcPr>
-            <w:tcW w:type="dxa" w:w="3118"/>
+            <w:tcW w:type="dxa" w:w="4252"/>
             <w:shd w:val="clear" w:color="auto" w:fill="F7F7F7"/>
           </w:tcPr>
           <w:p>
@@ -958,175 +788,7 @@
                 <w:color w:val="444444"/>
                 <w:sz w:val="19"/>
               </w:rPr>
-              <w:t>Velocity-based ranking</w:t>
-            </w:r>
-          </w:p>
-        </w:tc>
-      </w:tr>
-      <w:tr>
-        <w:tc>
-          <w:tcPr>
-            <w:tcW w:type="dxa" w:w="4535"/>
-            <w:shd w:val="clear" w:color="auto" w:fill="FFFFFF"/>
-          </w:tcPr>
-          <w:p>
-            <w:pPr>
-              <w:spacing w:before="60" w:after="60"/>
-            </w:pPr>
-            <w:r>
-              <w:rPr>
-                <w:color w:val="444444"/>
-                <w:sz w:val="19"/>
-              </w:rPr>
-              <w:t>Reorder alerts based on stock and velocity</w:t>
-            </w:r>
-          </w:p>
-        </w:tc>
-        <w:tc>
-          <w:tcPr>
-            <w:tcW w:type="dxa" w:w="1417"/>
-            <w:shd w:val="clear" w:color="auto" w:fill="FFFFFF"/>
-          </w:tcPr>
-          <w:p>
-            <w:pPr>
-              <w:spacing w:before="60" w:after="60"/>
-            </w:pPr>
-            <w:r>
-              <w:rPr>
-                <w:color w:val="444444"/>
-                <w:sz w:val="19"/>
-              </w:rPr>
-              <w:t>Core</w:t>
-            </w:r>
-          </w:p>
-        </w:tc>
-        <w:tc>
-          <w:tcPr>
-            <w:tcW w:type="dxa" w:w="3118"/>
-            <w:shd w:val="clear" w:color="auto" w:fill="FFFFFF"/>
-          </w:tcPr>
-          <w:p>
-            <w:pPr>
-              <w:spacing w:before="60" w:after="60"/>
-            </w:pPr>
-            <w:r>
-              <w:rPr>
-                <w:color w:val="444444"/>
-                <w:sz w:val="19"/>
-              </w:rPr>
-              <w:t>Urgency-flagged reorder list</w:t>
-            </w:r>
-          </w:p>
-        </w:tc>
-      </w:tr>
-      <w:tr>
-        <w:tc>
-          <w:tcPr>
-            <w:tcW w:type="dxa" w:w="4535"/>
-            <w:shd w:val="clear" w:color="auto" w:fill="F7F7F7"/>
-          </w:tcPr>
-          <w:p>
-            <w:pPr>
-              <w:spacing w:before="60" w:after="60"/>
-            </w:pPr>
-            <w:r>
-              <w:rPr>
-                <w:color w:val="444444"/>
-                <w:sz w:val="19"/>
-              </w:rPr>
-              <w:t>Gross profit % by product</w:t>
-            </w:r>
-          </w:p>
-        </w:tc>
-        <w:tc>
-          <w:tcPr>
-            <w:tcW w:type="dxa" w:w="1417"/>
-            <w:shd w:val="clear" w:color="auto" w:fill="F7F7F7"/>
-          </w:tcPr>
-          <w:p>
-            <w:pPr>
-              <w:spacing w:before="60" w:after="60"/>
-            </w:pPr>
-            <w:r>
-              <w:rPr>
-                <w:color w:val="444444"/>
-                <w:sz w:val="19"/>
-              </w:rPr>
-              <w:t>High</w:t>
-            </w:r>
-          </w:p>
-        </w:tc>
-        <w:tc>
-          <w:tcPr>
-            <w:tcW w:type="dxa" w:w="3118"/>
-            <w:shd w:val="clear" w:color="auto" w:fill="F7F7F7"/>
-          </w:tcPr>
-          <w:p>
-            <w:pPr>
-              <w:spacing w:before="60" w:after="60"/>
-            </w:pPr>
-            <w:r>
-              <w:rPr>
-                <w:color w:val="444444"/>
-                <w:sz w:val="19"/>
-              </w:rPr>
-              <w:t>Requires cost price data</w:t>
-            </w:r>
-          </w:p>
-        </w:tc>
-      </w:tr>
-      <w:tr>
-        <w:tc>
-          <w:tcPr>
-            <w:tcW w:type="dxa" w:w="4535"/>
-            <w:shd w:val="clear" w:color="auto" w:fill="FFFFFF"/>
-          </w:tcPr>
-          <w:p>
-            <w:pPr>
-              <w:spacing w:before="60" w:after="60"/>
-            </w:pPr>
-            <w:r>
-              <w:rPr>
-                <w:color w:val="444444"/>
-                <w:sz w:val="19"/>
-              </w:rPr>
-              <w:t>Physical stock count reconciliation</w:t>
-            </w:r>
-          </w:p>
-        </w:tc>
-        <w:tc>
-          <w:tcPr>
-            <w:tcW w:type="dxa" w:w="1417"/>
-            <w:shd w:val="clear" w:color="auto" w:fill="FFFFFF"/>
-          </w:tcPr>
-          <w:p>
-            <w:pPr>
-              <w:spacing w:before="60" w:after="60"/>
-            </w:pPr>
-            <w:r>
-              <w:rPr>
-                <w:color w:val="444444"/>
-                <w:sz w:val="19"/>
-              </w:rPr>
-              <w:t>High</w:t>
-            </w:r>
-          </w:p>
-        </w:tc>
-        <w:tc>
-          <w:tcPr>
-            <w:tcW w:type="dxa" w:w="3118"/>
-            <w:shd w:val="clear" w:color="auto" w:fill="FFFFFF"/>
-          </w:tcPr>
-          <w:p>
-            <w:pPr>
-              <w:spacing w:before="60" w:after="60"/>
-            </w:pPr>
-            <w:r>
-              <w:rPr>
-                <w:color w:val="444444"/>
-                <w:sz w:val="19"/>
-              </w:rPr>
-              <w:t>Actual vs theoretical</w:t>
+              <w:t>Revenue trends over time; gross profit % by product and month</w:t>
             </w:r>
           </w:p>
         </w:tc>
@@ -1137,6 +799,90 @@
         <w:spacing w:after="40"/>
       </w:pPr>
     </w:p>
+    <w:tbl>
+      <w:tblPr>
+        <w:tblW w:type="auto" w:w="0"/>
+        <w:jc w:val="left"/>
+        <w:tblLook w:firstColumn="1" w:firstRow="1" w:lastColumn="0" w:lastRow="0" w:noHBand="0" w:noVBand="1" w:val="04A0"/>
+      </w:tblPr>
+      <w:tblGrid>
+        <w:gridCol w:w="9122"/>
+      </w:tblGrid>
+      <w:tr>
+        <w:tc>
+          <w:tcPr>
+            <w:tcW w:type="dxa" w:w="8352"/>
+            <w:shd w:val="clear" w:color="auto" w:fill="F0F7F0"/>
+            <w:tcBorders>
+              <w:top w:val="none" w:sz="4" w:space="0" w:color="auto"/>
+              <w:left w:val="single" w:sz="16" w:space="0" w:color="1A7A3C"/>
+              <w:bottom w:val="none" w:sz="4" w:space="0" w:color="auto"/>
+              <w:right w:val="none" w:sz="4" w:space="0" w:color="auto"/>
+            </w:tcBorders>
+          </w:tcPr>
+          <w:p>
+            <w:pPr>
+              <w:spacing w:before="120" w:after="120"/>
+            </w:pPr>
+            <w:r>
+              <w:rPr>
+                <w:color w:val="444444"/>
+                <w:sz w:val="20"/>
+              </w:rPr>
+              <w:t>The connection between tabs is deliberate and sequential: what sold (Weekly Report) directly drives what needs reordering (Order Prediction) via sales velocity. What we have (Stock Reconciliation) provides the physical count that makes the reorder calculation accurate. Finance draws on all three to give the full picture.</w:t>
+            </w:r>
+          </w:p>
+        </w:tc>
+      </w:tr>
+    </w:tbl>
+    <w:p>
+      <w:pPr>
+        <w:spacing w:after="80"/>
+      </w:pPr>
+    </w:p>
+    <w:p>
+      <w:pPr>
+        <w:spacing w:before="280" w:after="80"/>
+      </w:pPr>
+      <w:r>
+        <w:rPr>
+          <w:b/>
+          <w:color w:val="444444"/>
+          <w:sz w:val="22"/>
+        </w:rPr>
+        <w:t>What This Replaced</w:t>
+      </w:r>
+    </w:p>
+    <w:p>
+      <w:pPr>
+        <w:spacing w:after="120"/>
+      </w:pPr>
+      <w:r>
+        <w:rPr>
+          <w:color w:val="444444"/>
+          <w:sz w:val="21"/>
+        </w:rPr>
+        <w:t>The previous dashboard had five tabs built incrementally. Over time it accumulated overlapping views, a default screen that didn't reflect daily use, and no physical stock count workflow — despite the required database infrastructure already existing. The redesign retires three of the five tabs and consolidates their content with no loss of functionality.</w:t>
+      </w:r>
+    </w:p>
+    <w:p/>
+    <w:p>
+      <w:pPr>
+        <w:spacing w:before="360" w:after="160"/>
+        <w:pBdr>
+          <w:bottom w:val="single" w:sz="4" w:space="4" w:color="CCCCCC"/>
+        </w:pBdr>
+      </w:pPr>
+      <w:r>
+        <w:rPr>
+          <w:b/>
+          <w:caps/>
+          <w:color w:val="888888"/>
+          <w:sz w:val="20"/>
+        </w:rPr>
+        <w:t>2. BACKGROUND</w:t>
+      </w:r>
+    </w:p>
     <w:p>
       <w:pPr>
         <w:spacing w:before="200" w:after="120"/>
@@ -1147,7 +893,7 @@
           <w:color w:val="111111"/>
           <w:sz w:val="26"/>
         </w:rPr>
-        <w:t>Practical First-Version Requirements</w:t>
+        <w:t>The Business</w:t>
       </w:r>
     </w:p>
     <w:p>
@@ -1159,7 +905,7 @@
           <w:color w:val="444444"/>
           <w:sz w:val="21"/>
         </w:rPr>
-        <w:t>From the benchmark research, five requirements were defined for a practical first version of the redesigned dashboard:</w:t>
+        <w:t>ONE LDN's shop operates across two distinct product areas with different inventory characteristics:</w:t>
       </w:r>
     </w:p>
     <w:p>
@@ -1168,20 +914,12 @@
         <w:spacing w:after="60"/>
         <w:ind w:left="340"/>
       </w:pPr>
-      <w:r>
-        <w:rPr>
-          <w:b/>
-          <w:color w:val="111111"/>
-          <w:sz w:val="21"/>
-        </w:rPr>
-        <w:t xml:space="preserve">Headline KPIs — </w:t>
-      </w:r>
       <w:r>
         <w:rPr>
           <w:color w:val="444444"/>
           <w:sz w:val="21"/>
         </w:rPr>
-        <w:t>Revenue, units sold, gross margin where available, stock on hand — broken down by product and variant.</w:t>
+        <w:t>Café — coffees, protein shakes, energy drinks, bars and snacks. High-frequency, ordered on a two-week cycle from suppliers including Muscle Finesse. Products turn over weekly; stock runs out quickly if not monitored.</w:t>
       </w:r>
     </w:p>
     <w:p>
@@ -1190,64 +928,49 @@
         <w:spacing w:after="60"/>
         <w:ind w:left="340"/>
       </w:pPr>
-      <w:r>
-        <w:rPr>
-          <w:b/>
-          <w:color w:val="111111"/>
-          <w:sz w:val="21"/>
-        </w:rPr>
-        <w:t xml:space="preserve">Top products table — </w:t>
-      </w:r>
       <w:r>
         <w:rPr>
           <w:color w:val="444444"/>
           <w:sz w:val="21"/>
         </w:rPr>
-        <w:t>Ranked by units sold, showing revenue, sell-through rate, and days of stock remaining.</w:t>
+        <w:t>Merchandise — branded apparel and accessories. Longer lead times, ordered on an eight-week cycle from suppliers including Tapstitch. Lower velocity but higher unit value; over-ordering ties up cash.</w:t>
       </w:r>
     </w:p>
     <w:p>
       <w:pPr>
-        <w:pStyle w:val="ListBullet"/>
-        <w:spacing w:after="60"/>
-        <w:ind w:left="340"/>
-      </w:pPr>
-      <w:r>
-        <w:rPr>
-          <w:b/>
-          <w:color w:val="111111"/>
-          <w:sz w:val="21"/>
-        </w:rPr>
-        <w:t xml:space="preserve">Stock health panel — </w:t>
-      </w:r>
+        <w:spacing w:after="120"/>
+      </w:pPr>
       <w:r>
         <w:rPr>
           <w:color w:val="444444"/>
           <w:sz w:val="21"/>
         </w:rPr>
-        <w:t>A clear summary of how many products are low-stock, healthy, overstocked, or excess.</w:t>
+        <w:t>Sales flow from WodBoard into the dashboard via weekly CSV upload. Deliveries are logged by uploading supplier PDF invoices (parsed automatically) or by manual entry. All data is stored in Supabase.</w:t>
       </w:r>
     </w:p>
     <w:p>
       <w:pPr>
-        <w:pStyle w:val="ListBullet"/>
-        <w:spacing w:after="60"/>
-        <w:ind w:left="340"/>
+        <w:spacing w:before="200" w:after="120"/>
       </w:pPr>
       <w:r>
         <w:rPr>
           <w:b/>
           <w:color w:val="111111"/>
-          <w:sz w:val="21"/>
+          <w:sz w:val="26"/>
         </w:rPr>
-        <w:t xml:space="preserve">Trend chart — </w:t>
+        <w:t>Problems with the Previous Design</w:t>
       </w:r>
+    </w:p>
+    <w:p>
+      <w:pPr>
+        <w:spacing w:after="120"/>
+      </w:pPr>
       <w:r>
         <w:rPr>
           <w:color w:val="444444"/>
           <w:sz w:val="21"/>
         </w:rPr>
-        <w:t>Revenue and units sold over time, segmented by category.</w:t>
+        <w:t>The original dashboard grew tab by tab as requirements were added. By the time the redesign was initiated it had five tabs, several of which served overlapping purposes:</w:t>
       </w:r>
     </w:p>
     <w:p>
@@ -1256,20 +979,359 @@
         <w:spacing w:after="60"/>
         <w:ind w:left="340"/>
       </w:pPr>
-      <w:r>
-        <w:rPr>
-          <w:b/>
-          <w:color w:val="111111"/>
-          <w:sz w:val="21"/>
-        </w:rPr>
-        <w:t xml:space="preserve">Reorder list — </w:t>
-      </w:r>
       <w:r>
         <w:rPr>
           <w:color w:val="444444"/>
           <w:sz w:val="21"/>
         </w:rPr>
-        <w:t>Products below threshold or projected to run out, with suggested order quantities.</w:t>
+        <w:t>Overview and Top Sellers both showed sales rankings in different formats — the same question answered twice.</w:t>
+      </w:r>
+    </w:p>
+    <w:p>
+      <w:pPr>
+        <w:pStyle w:val="ListBullet"/>
+        <w:spacing w:after="60"/>
+        <w:ind w:left="340"/>
+      </w:pPr>
+      <w:r>
+        <w:rPr>
+          <w:color w:val="444444"/>
+          <w:sz w:val="21"/>
+        </w:rPr>
+        <w:t>Stock History combined delivery reconciliation with gross profit reporting, serving two different audiences in one view.</w:t>
+      </w:r>
+    </w:p>
+    <w:p>
+      <w:pPr>
+        <w:pStyle w:val="ListBullet"/>
+        <w:spacing w:after="60"/>
+        <w:ind w:left="340"/>
+      </w:pPr>
+      <w:r>
+        <w:rPr>
+          <w:color w:val="444444"/>
+          <w:sz w:val="21"/>
+        </w:rPr>
+        <w:t>The default Overview tab showed all-time data rather than the current week, making it less useful for the most common use case.</w:t>
+      </w:r>
+    </w:p>
+    <w:p>
+      <w:pPr>
+        <w:pStyle w:val="ListBullet"/>
+        <w:spacing w:after="60"/>
+        <w:ind w:left="340"/>
+      </w:pPr>
+      <w:r>
+        <w:rPr>
+          <w:color w:val="444444"/>
+          <w:sz w:val="21"/>
+        </w:rPr>
+        <w:t>No physical stock count workflow existed, even though a Supabase table (shop_stock_takes) had been created for exactly this purpose.</w:t>
+      </w:r>
+    </w:p>
+    <w:p>
+      <w:pPr>
+        <w:pStyle w:val="ListBullet"/>
+        <w:spacing w:after="60"/>
+        <w:ind w:left="340"/>
+      </w:pPr>
+      <w:r>
+        <w:rPr>
+          <w:color w:val="444444"/>
+          <w:sz w:val="21"/>
+        </w:rPr>
+        <w:t>Stock urgency information (days of stock remaining, Order Now flags) required navigating to the Order Prediction tab — it was not visible from the default screen.</w:t>
+      </w:r>
+    </w:p>
+    <w:p/>
+    <w:p>
+      <w:pPr>
+        <w:spacing w:before="360" w:after="160"/>
+        <w:pBdr>
+          <w:bottom w:val="single" w:sz="4" w:space="4" w:color="CCCCCC"/>
+        </w:pBdr>
+      </w:pPr>
+      <w:r>
+        <w:rPr>
+          <w:b/>
+          <w:caps/>
+          <w:color w:val="888888"/>
+          <w:sz w:val="20"/>
+        </w:rPr>
+        <w:t>3. WHAT WE MEASURE AND WHY</w:t>
+      </w:r>
+    </w:p>
+    <w:p>
+      <w:pPr>
+        <w:spacing w:after="120"/>
+      </w:pPr>
+      <w:r>
+        <w:rPr>
+          <w:color w:val="444444"/>
+          <w:sz w:val="21"/>
+        </w:rPr>
+        <w:t>The dashboard is built around three tracked quantities and the four outcomes they produce. The design principle is that each quantity is measured once, in the right place, with no duplication across tabs.</w:t>
+      </w:r>
+    </w:p>
+    <w:p>
+      <w:pPr>
+        <w:spacing w:before="200" w:after="120"/>
+      </w:pPr>
+      <w:r>
+        <w:rPr>
+          <w:b/>
+          <w:color w:val="111111"/>
+          <w:sz w:val="26"/>
+        </w:rPr>
+        <w:t>The Three Inputs</w:t>
+      </w:r>
+    </w:p>
+    <w:p>
+      <w:pPr>
+        <w:spacing w:before="200" w:after="80"/>
+      </w:pPr>
+      <w:r>
+        <w:rPr>
+          <w:b/>
+          <w:color w:val="444444"/>
+          <w:sz w:val="22"/>
+        </w:rPr>
+        <w:t>Total Sales</w:t>
+      </w:r>
+    </w:p>
+    <w:p>
+      <w:pPr>
+        <w:spacing w:after="120"/>
+      </w:pPr>
+      <w:r>
+        <w:rPr>
+          <w:color w:val="444444"/>
+          <w:sz w:val="21"/>
+        </w:rPr>
+        <w:t>Every transaction is captured in the WodBoard CSV: product, quantity, revenue, date. This is the primary data source. It feeds the Weekly Report (what sold), drives the velocity calculation used by Order Prediction (how fast is it selling), and contributes the "sold" column in Stock Reconciliation.</w:t>
+      </w:r>
+    </w:p>
+    <w:p>
+      <w:pPr>
+        <w:spacing w:before="200" w:after="80"/>
+      </w:pPr>
+      <w:r>
+        <w:rPr>
+          <w:b/>
+          <w:color w:val="444444"/>
+          <w:sz w:val="22"/>
+        </w:rPr>
+        <w:t>Total Deliveries</w:t>
+      </w:r>
+    </w:p>
+    <w:p>
+      <w:pPr>
+        <w:spacing w:after="120"/>
+      </w:pPr>
+      <w:r>
+        <w:rPr>
+          <w:color w:val="444444"/>
+          <w:sz w:val="21"/>
+        </w:rPr>
+        <w:t>Every delivery is logged with product, quantity received, date, and unit price. This feeds the Stock Reconciliation "received" column, provides the cost base for gross profit calculation in Finance, and resets the estimated stock baseline used by Order Prediction.</w:t>
+      </w:r>
+    </w:p>
+    <w:p>
+      <w:pPr>
+        <w:spacing w:before="200" w:after="80"/>
+      </w:pPr>
+      <w:r>
+        <w:rPr>
+          <w:b/>
+          <w:color w:val="444444"/>
+          <w:sz w:val="22"/>
+        </w:rPr>
+        <w:t>Total Stock</w:t>
+      </w:r>
+    </w:p>
+    <w:p>
+      <w:pPr>
+        <w:spacing w:after="120"/>
+      </w:pPr>
+      <w:r>
+        <w:rPr>
+          <w:color w:val="444444"/>
+          <w:sz w:val="21"/>
+        </w:rPr>
+        <w:t>The physical count entered in Stock Reconciliation. Without this, the system can only estimate stock from deliveries minus sales — which accumulates error over time. The count grounds the system in reality and makes Order Prediction significantly more accurate. A monthly count cadence is planned rather than weekly.</w:t>
+      </w:r>
+    </w:p>
+    <w:p>
+      <w:pPr>
+        <w:spacing w:before="200" w:after="120"/>
+      </w:pPr>
+      <w:r>
+        <w:rPr>
+          <w:b/>
+          <w:color w:val="111111"/>
+          <w:sz w:val="26"/>
+        </w:rPr>
+        <w:t>The Four Outputs</w:t>
+      </w:r>
+    </w:p>
+    <w:p>
+      <w:pPr>
+        <w:spacing w:before="200" w:after="80"/>
+      </w:pPr>
+      <w:r>
+        <w:rPr>
+          <w:b/>
+          <w:color w:val="444444"/>
+          <w:sz w:val="22"/>
+        </w:rPr>
+        <w:t>Weekly Report — What Sold</w:t>
+      </w:r>
+    </w:p>
+    <w:p>
+      <w:pPr>
+        <w:spacing w:after="120"/>
+      </w:pPr>
+      <w:r>
+        <w:rPr>
+          <w:color w:val="444444"/>
+          <w:sz w:val="21"/>
+        </w:rPr>
+        <w:t>A week-on-week view of sales by product and category. The primary screen for anyone opening the dashboard. Shows units sold, revenue, and the percentage change versus the previous week for each category. Also surfaces days of stock remaining and a stock health summary so that urgent reorder situations are visible without navigating away.</w:t>
+      </w:r>
+    </w:p>
+    <w:p>
+      <w:pPr>
+        <w:spacing w:after="120"/>
+      </w:pPr>
+      <w:r>
+        <w:rPr>
+          <w:color w:val="444444"/>
+          <w:sz w:val="21"/>
+        </w:rPr>
+        <w:t>Measured: units sold, revenue per product and category, week-on-week change, days of stock.</w:t>
+      </w:r>
+    </w:p>
+    <w:p>
+      <w:pPr>
+        <w:spacing w:before="200" w:after="80"/>
+      </w:pPr>
+      <w:r>
+        <w:rPr>
+          <w:b/>
+          <w:color w:val="444444"/>
+          <w:sz w:val="22"/>
+        </w:rPr>
+        <w:t>Stock Reconciliation — What We Have</w:t>
+      </w:r>
+    </w:p>
+    <w:p>
+      <w:pPr>
+        <w:spacing w:after="120"/>
+      </w:pPr>
+      <w:r>
+        <w:rPr>
+          <w:color w:val="444444"/>
+          <w:sz w:val="21"/>
+        </w:rPr>
+        <w:t>The bridge between the theoretical stock position (deliveries minus sales) and the physical reality. Each week shows the opening balance, units received, units sold, the theoretical closing stock, and — when a physical count has been entered — the variance. A monthly variance summary aggregates shrinkage or surplus across all counted weeks.</w:t>
+      </w:r>
+    </w:p>
+    <w:p>
+      <w:pPr>
+        <w:spacing w:after="120"/>
+      </w:pPr>
+      <w:r>
+        <w:rPr>
+          <w:color w:val="444444"/>
+          <w:sz w:val="21"/>
+        </w:rPr>
+        <w:t>Measured: opening balance, deliveries in, sold out, theoretical stock, physical count, variance.</w:t>
+      </w:r>
+    </w:p>
+    <w:p>
+      <w:pPr>
+        <w:spacing w:before="200" w:after="80"/>
+      </w:pPr>
+      <w:r>
+        <w:rPr>
+          <w:b/>
+          <w:color w:val="444444"/>
+          <w:sz w:val="22"/>
+        </w:rPr>
+        <w:t>Order Prediction — What Needs Reordering</w:t>
+      </w:r>
+    </w:p>
+    <w:p>
+      <w:pPr>
+        <w:spacing w:after="120"/>
+      </w:pPr>
+      <w:r>
+        <w:rPr>
+          <w:color w:val="444444"/>
+          <w:sz w:val="21"/>
+        </w:rPr>
+        <w:t>A velocity-driven reorder view. For each product, the system calculates average weekly sales over the last four weeks, divides the estimated stock by that velocity to arrive at days of stock remaining, and compares it to the order cycle threshold. Products falling below the threshold are flagged Order Now or Order Soon. A suggested order quantity covers the next full cycle.</w:t>
+      </w:r>
+    </w:p>
+    <w:p>
+      <w:pPr>
+        <w:spacing w:after="120"/>
+      </w:pPr>
+      <w:r>
+        <w:rPr>
+          <w:color w:val="444444"/>
+          <w:sz w:val="21"/>
+        </w:rPr>
+        <w:t>This tab is informed by both sales data (velocity) and reconciliation data (stock on hand). The more accurate the physical count, the more reliable the reorder suggestion.</w:t>
+      </w:r>
+    </w:p>
+    <w:p>
+      <w:pPr>
+        <w:spacing w:after="120"/>
+      </w:pPr>
+      <w:r>
+        <w:rPr>
+          <w:color w:val="444444"/>
+          <w:sz w:val="21"/>
+        </w:rPr>
+        <w:t>Measured: velocity (avg units/week), estimated stock, days of cover, suggested order quantity, urgency status.</w:t>
+      </w:r>
+    </w:p>
+    <w:p>
+      <w:pPr>
+        <w:spacing w:before="200" w:after="80"/>
+      </w:pPr>
+      <w:r>
+        <w:rPr>
+          <w:b/>
+          <w:color w:val="444444"/>
+          <w:sz w:val="22"/>
+        </w:rPr>
+        <w:t>Finance — Trends and Margin</w:t>
+      </w:r>
+    </w:p>
+    <w:p>
+      <w:pPr>
+        <w:spacing w:after="120"/>
+      </w:pPr>
+      <w:r>
+        <w:rPr>
+          <w:color w:val="444444"/>
+          <w:sz w:val="21"/>
+        </w:rPr>
+        <w:t>A management-level view for monthly review. Shows revenue by category over time (all historical weeks) and gross profit percentage by product for a selected month. This is the only tab concerned with cost and margin — GP% is not shown elsewhere, avoiding any risk of it being used operationally before cost prices are fully populated.</w:t>
+      </w:r>
+    </w:p>
+    <w:p>
+      <w:pPr>
+        <w:spacing w:after="120"/>
+      </w:pPr>
+      <w:r>
+        <w:rPr>
+          <w:color w:val="444444"/>
+          <w:sz w:val="21"/>
+        </w:rPr>
+        <w:t>Measured: weekly revenue by category (trend), revenue, COGS, and GP% by product (monthly).</w:t>
       </w:r>
     </w:p>
     <w:p/>
@@ -1288,18 +1350,6 @@
           <w:sz w:val="20"/>
         </w:rPr>
         <w:t>4. THE PREVIOUS DESIGN — FIVE-TAB STRUCTURE</w:t>
-      </w:r>
-    </w:p>
-    <w:p>
-      <w:pPr>
-        <w:spacing w:after="120"/>
-      </w:pPr>
-      <w:r>
-        <w:rPr>
-          <w:color w:val="444444"/>
-          <w:sz w:val="21"/>
-        </w:rPr>
-        <w:t>The original dashboard comprised five tabs. The following summarises each tab's purpose and the structural issues that informed the decision to redesign.</w:t>
       </w:r>
     </w:p>
     <w:tbl>
@@ -1368,7 +1418,7 @@
                 <w:color w:val="FFFFFF"/>
                 <w:sz w:val="18"/>
               </w:rPr>
-              <w:t>KEY ISSUES</w:t>
+              <w:t>ISSUES</w:t>
             </w:r>
           </w:p>
         </w:tc>
@@ -1406,7 +1456,7 @@
                 <w:color w:val="444444"/>
                 <w:sz w:val="19"/>
               </w:rPr>
-              <w:t>KPI cards, revenue bar chart, category donut, top-10 product table</w:t>
+              <w:t>KPI cards, weekly revenue bar chart, category donut, top-10 product table</w:t>
             </w:r>
           </w:p>
         </w:tc>
@@ -1424,7 +1474,7 @@
                 <w:color w:val="444444"/>
                 <w:sz w:val="19"/>
               </w:rPr>
-              <w:t>Mixed all-time and current-period data; overlaps with Top Sellers; stock alerts buried here rather than in Order Prediction</w:t>
+              <w:t>Mixed all-time and current-period data; overlapped with Top Sellers; stock alerts placed here rather than in Order Prediction</w:t>
             </w:r>
           </w:p>
         </w:tc>
@@ -1462,7 +1512,7 @@
                 <w:color w:val="444444"/>
                 <w:sz w:val="19"/>
               </w:rPr>
-              <w:t>Brand and collection hierarchy tables for Café and Merch separately</w:t>
+              <w:t>Expandable brand and collection hierarchy tables for Café and Merch</w:t>
             </w:r>
           </w:p>
         </w:tc>
@@ -1480,7 +1530,7 @@
                 <w:color w:val="444444"/>
                 <w:sz w:val="19"/>
               </w:rPr>
-              <w:t>Duplicates the "what's selling" question already partially answered by Overview; brand hierarchy not available on the default view</w:t>
+              <w:t>Same question as Overview ("what's selling?") in a different format — required visiting two tabs for the same information</w:t>
             </w:r>
           </w:p>
         </w:tc>
@@ -1518,7 +1568,7 @@
                 <w:color w:val="444444"/>
                 <w:sz w:val="19"/>
               </w:rPr>
-              <w:t>Stacked line charts showing weekly revenue and units by category</w:t>
+              <w:t>Stacked line charts of weekly revenue and units by category</w:t>
             </w:r>
           </w:p>
         </w:tc>
@@ -1536,7 +1586,7 @@
                 <w:color w:val="444444"/>
                 <w:sz w:val="19"/>
               </w:rPr>
-              <w:t>Useful content isolated on a dedicated tab; not integrated with financial review</w:t>
+              <w:t>Useful content isolated on its own tab; not integrated with financial review</w:t>
             </w:r>
           </w:p>
         </w:tc>
@@ -1592,7 +1642,7 @@
                 <w:color w:val="444444"/>
                 <w:sz w:val="19"/>
               </w:rPr>
-              <w:t>Strong and well-executed; appropriately isolated; correct as-is</w:t>
+              <w:t>Strong and correctly isolated — no structural issues; tab position was wrong (should follow reconciliation, not precede it)</w:t>
             </w:r>
           </w:p>
         </w:tc>
@@ -1648,7 +1698,7 @@
                 <w:color w:val="444444"/>
                 <w:sz w:val="19"/>
               </w:rPr>
-              <w:t>Two distinct audiences (operational and financial) served by one tab; no physical count entry; GP% data hard to find</w:t>
+              <w:t>Two audiences in one view: operational (stock flow) and financial (GP%). No physical count entry despite the database table existing</w:t>
             </w:r>
           </w:p>
         </w:tc>
@@ -1669,7 +1719,7 @@
           <w:color w:val="111111"/>
           <w:sz w:val="26"/>
         </w:rPr>
-        <w:t>What Worked Well in the Previous Design</w:t>
+        <w:t>What the Previous Design Did Well</w:t>
       </w:r>
     </w:p>
     <w:p>
@@ -1683,7 +1733,7 @@
           <w:color w:val="444444"/>
           <w:sz w:val="21"/>
         </w:rPr>
-        <w:t>The Order Prediction engine — velocity calculation, covers bar, urgency flags, and tab badge — was well-conceived and ahead of most entry-level commercial tools.</w:t>
+        <w:t>The Order Prediction velocity engine — covers calculation, urgency flags, tab badge — was well-conceived and ahead of most entry-level commercial tools.</w:t>
       </w:r>
     </w:p>
     <w:p>
@@ -1697,7 +1747,7 @@
           <w:color w:val="444444"/>
           <w:sz w:val="21"/>
         </w:rPr>
-        <w:t>PDF invoice parsing for Muscle Finesse and Tapstitch deliveries, reducing manual data entry significantly.</w:t>
+        <w:t>PDF invoice parsing for Muscle Finesse and Tapstitch deliveries, reducing manual data entry at the point of goods receipt.</w:t>
       </w:r>
     </w:p>
     <w:p>
@@ -1711,7 +1761,7 @@
           <w:color w:val="444444"/>
           <w:sz w:val="21"/>
         </w:rPr>
-        <w:t>The café/merch cycle-time distinction (two-week vs eight-week order cycles) correctly modelled the different inventory dynamics.</w:t>
+        <w:t>Separate order cycle thresholds for café (two weeks) and merch (eight weeks), correctly modelling the different inventory dynamics of each product type.</w:t>
       </w:r>
     </w:p>
     <w:p>
@@ -1725,7 +1775,7 @@
           <w:color w:val="444444"/>
           <w:sz w:val="21"/>
         </w:rPr>
-        <w:t>The product lookup table structure (category, brand, cost price, pack size, min stock) provided a solid master data foundation.</w:t>
+        <w:t>A clean product master table (category, brand, cost price, pack size, minimum stock) providing a reliable data foundation.</w:t>
       </w:r>
     </w:p>
     <w:p>
@@ -1739,652 +1789,8 @@
           <w:color w:val="444444"/>
           <w:sz w:val="21"/>
         </w:rPr>
-        <w:t>The exclusion logic for in-house products (house-made shakes, coffee) correctly scoped what the system should and should not attempt to predict.</w:t>
+        <w:t>Correct exclusion of in-house products (house-made shakes, coffee) from stock tracking — the system only predicted stock for items that are actually ordered.</w:t>
       </w:r>
-    </w:p>
-    <w:p>
-      <w:pPr>
-        <w:spacing w:before="200" w:after="120"/>
-      </w:pPr>
-      <w:r>
-        <w:rPr>
-          <w:b/>
-          <w:color w:val="111111"/>
-          <w:sz w:val="26"/>
-        </w:rPr>
-        <w:t>Coverage Against Benchmark Metrics</w:t>
-      </w:r>
-    </w:p>
-    <w:tbl>
-      <w:tblPr>
-        <w:tblStyle w:val="TableGrid"/>
-        <w:tblW w:type="auto" w:w="0"/>
-        <w:jc w:val="left"/>
-        <w:tblLook w:firstColumn="1" w:firstRow="1" w:lastColumn="0" w:lastRow="0" w:noHBand="0" w:noVBand="1" w:val="04A0"/>
-      </w:tblPr>
-      <w:tblGrid>
-        <w:gridCol w:w="3041"/>
-        <w:gridCol w:w="3041"/>
-        <w:gridCol w:w="3041"/>
-      </w:tblGrid>
-      <w:tr>
-        <w:tc>
-          <w:tcPr>
-            <w:tcW w:type="dxa" w:w="3118"/>
-            <w:shd w:val="clear" w:color="auto" w:fill="111111"/>
-          </w:tcPr>
-          <w:p>
-            <w:pPr>
-              <w:spacing w:before="80" w:after="80"/>
-            </w:pPr>
-            <w:r>
-              <w:rPr>
-                <w:b/>
-                <w:color w:val="FFFFFF"/>
-                <w:sz w:val="18"/>
-              </w:rPr>
-              <w:t>METRIC</w:t>
-            </w:r>
-          </w:p>
-        </w:tc>
-        <w:tc>
-          <w:tcPr>
-            <w:tcW w:type="dxa" w:w="1417"/>
-            <w:shd w:val="clear" w:color="auto" w:fill="111111"/>
-          </w:tcPr>
-          <w:p>
-            <w:pPr>
-              <w:spacing w:before="80" w:after="80"/>
-            </w:pPr>
-            <w:r>
-              <w:rPr>
-                <w:b/>
-                <w:color w:val="FFFFFF"/>
-                <w:sz w:val="18"/>
-              </w:rPr>
-              <w:t>STATUS</w:t>
-            </w:r>
-          </w:p>
-        </w:tc>
-        <w:tc>
-          <w:tcPr>
-            <w:tcW w:type="dxa" w:w="4535"/>
-            <w:shd w:val="clear" w:color="auto" w:fill="111111"/>
-          </w:tcPr>
-          <w:p>
-            <w:pPr>
-              <w:spacing w:before="80" w:after="80"/>
-            </w:pPr>
-            <w:r>
-              <w:rPr>
-                <w:b/>
-                <w:color w:val="FFFFFF"/>
-                <w:sz w:val="18"/>
-              </w:rPr>
-              <w:t>COMMENT</w:t>
-            </w:r>
-          </w:p>
-        </w:tc>
-      </w:tr>
-      <w:tr>
-        <w:tc>
-          <w:tcPr>
-            <w:tcW w:type="dxa" w:w="3118"/>
-            <w:shd w:val="clear" w:color="auto" w:fill="FFFFFF"/>
-          </w:tcPr>
-          <w:p>
-            <w:pPr>
-              <w:spacing w:before="60" w:after="60"/>
-            </w:pPr>
-            <w:r>
-              <w:rPr>
-                <w:color w:val="444444"/>
-                <w:sz w:val="19"/>
-              </w:rPr>
-              <w:t>Top-selling products and categories</w:t>
-            </w:r>
-          </w:p>
-        </w:tc>
-        <w:tc>
-          <w:tcPr>
-            <w:tcW w:type="dxa" w:w="1417"/>
-            <w:shd w:val="clear" w:color="auto" w:fill="FFFFFF"/>
-          </w:tcPr>
-          <w:p>
-            <w:pPr>
-              <w:spacing w:before="60" w:after="60"/>
-            </w:pPr>
-            <w:r>
-              <w:rPr>
-                <w:b w:val="0"/>
-                <w:color w:val="1A7A3C"/>
-                <w:sz w:val="19"/>
-              </w:rPr>
-              <w:t>Present</w:t>
-            </w:r>
-          </w:p>
-        </w:tc>
-        <w:tc>
-          <w:tcPr>
-            <w:tcW w:type="dxa" w:w="4535"/>
-            <w:shd w:val="clear" w:color="auto" w:fill="FFFFFF"/>
-          </w:tcPr>
-          <w:p>
-            <w:pPr>
-              <w:spacing w:before="60" w:after="60"/>
-            </w:pPr>
-            <w:r>
-              <w:rPr>
-                <w:color w:val="444444"/>
-                <w:sz w:val="19"/>
-              </w:rPr>
-              <w:t>Present but not as a week-on-week view</w:t>
-            </w:r>
-          </w:p>
-        </w:tc>
-      </w:tr>
-      <w:tr>
-        <w:tc>
-          <w:tcPr>
-            <w:tcW w:type="dxa" w:w="3118"/>
-            <w:shd w:val="clear" w:color="auto" w:fill="F7F7F7"/>
-          </w:tcPr>
-          <w:p>
-            <w:pPr>
-              <w:spacing w:before="60" w:after="60"/>
-            </w:pPr>
-            <w:r>
-              <w:rPr>
-                <w:color w:val="444444"/>
-                <w:sz w:val="19"/>
-              </w:rPr>
-              <w:t>Sell-through rate</w:t>
-            </w:r>
-          </w:p>
-        </w:tc>
-        <w:tc>
-          <w:tcPr>
-            <w:tcW w:type="dxa" w:w="1417"/>
-            <w:shd w:val="clear" w:color="auto" w:fill="F7F7F7"/>
-          </w:tcPr>
-          <w:p>
-            <w:pPr>
-              <w:spacing w:before="60" w:after="60"/>
-            </w:pPr>
-            <w:r>
-              <w:rPr>
-                <w:b/>
-                <w:color w:val="C0392B"/>
-                <w:sz w:val="19"/>
-              </w:rPr>
-              <w:t>Missing</w:t>
-            </w:r>
-          </w:p>
-        </w:tc>
-        <w:tc>
-          <w:tcPr>
-            <w:tcW w:type="dxa" w:w="4535"/>
-            <w:shd w:val="clear" w:color="auto" w:fill="F7F7F7"/>
-          </w:tcPr>
-          <w:p>
-            <w:pPr>
-              <w:spacing w:before="60" w:after="60"/>
-            </w:pPr>
-            <w:r>
-              <w:rPr>
-                <w:color w:val="444444"/>
-                <w:sz w:val="19"/>
-              </w:rPr>
-              <w:t>Not calculated anywhere in the system</w:t>
-            </w:r>
-          </w:p>
-        </w:tc>
-      </w:tr>
-      <w:tr>
-        <w:tc>
-          <w:tcPr>
-            <w:tcW w:type="dxa" w:w="3118"/>
-            <w:shd w:val="clear" w:color="auto" w:fill="FFFFFF"/>
-          </w:tcPr>
-          <w:p>
-            <w:pPr>
-              <w:spacing w:before="60" w:after="60"/>
-            </w:pPr>
-            <w:r>
-              <w:rPr>
-                <w:color w:val="444444"/>
-                <w:sz w:val="19"/>
-              </w:rPr>
-              <w:t>Days of inventory remaining</w:t>
-            </w:r>
-          </w:p>
-        </w:tc>
-        <w:tc>
-          <w:tcPr>
-            <w:tcW w:type="dxa" w:w="1417"/>
-            <w:shd w:val="clear" w:color="auto" w:fill="FFFFFF"/>
-          </w:tcPr>
-          <w:p>
-            <w:pPr>
-              <w:spacing w:before="60" w:after="60"/>
-            </w:pPr>
-            <w:r>
-              <w:rPr>
-                <w:b w:val="0"/>
-                <w:color w:val="1A7A3C"/>
-                <w:sz w:val="19"/>
-              </w:rPr>
-              <w:t>Present</w:t>
-            </w:r>
-          </w:p>
-        </w:tc>
-        <w:tc>
-          <w:tcPr>
-            <w:tcW w:type="dxa" w:w="4535"/>
-            <w:shd w:val="clear" w:color="auto" w:fill="FFFFFF"/>
-          </w:tcPr>
-          <w:p>
-            <w:pPr>
-              <w:spacing w:before="60" w:after="60"/>
-            </w:pPr>
-            <w:r>
-              <w:rPr>
-                <w:color w:val="444444"/>
-                <w:sz w:val="19"/>
-              </w:rPr>
-              <w:t>Order Prediction covers bar — strong</w:t>
-            </w:r>
-          </w:p>
-        </w:tc>
-      </w:tr>
-      <w:tr>
-        <w:tc>
-          <w:tcPr>
-            <w:tcW w:type="dxa" w:w="3118"/>
-            <w:shd w:val="clear" w:color="auto" w:fill="F7F7F7"/>
-          </w:tcPr>
-          <w:p>
-            <w:pPr>
-              <w:spacing w:before="60" w:after="60"/>
-            </w:pPr>
-            <w:r>
-              <w:rPr>
-                <w:color w:val="444444"/>
-                <w:sz w:val="19"/>
-              </w:rPr>
-              <w:t>Stock health flags</w:t>
-            </w:r>
-          </w:p>
-        </w:tc>
-        <w:tc>
-          <w:tcPr>
-            <w:tcW w:type="dxa" w:w="1417"/>
-            <w:shd w:val="clear" w:color="auto" w:fill="F7F7F7"/>
-          </w:tcPr>
-          <w:p>
-            <w:pPr>
-              <w:spacing w:before="60" w:after="60"/>
-            </w:pPr>
-            <w:r>
-              <w:rPr>
-                <w:b w:val="0"/>
-                <w:color w:val="996B00"/>
-                <w:sz w:val="19"/>
-              </w:rPr>
-              <w:t>Partial</w:t>
-            </w:r>
-          </w:p>
-        </w:tc>
-        <w:tc>
-          <w:tcPr>
-            <w:tcW w:type="dxa" w:w="4535"/>
-            <w:shd w:val="clear" w:color="auto" w:fill="F7F7F7"/>
-          </w:tcPr>
-          <w:p>
-            <w:pPr>
-              <w:spacing w:before="60" w:after="60"/>
-            </w:pPr>
-            <w:r>
-              <w:rPr>
-                <w:color w:val="444444"/>
-                <w:sz w:val="19"/>
-              </w:rPr>
-              <w:t>No overstocked/excess flag; no health summary panel</w:t>
-            </w:r>
-          </w:p>
-        </w:tc>
-      </w:tr>
-      <w:tr>
-        <w:tc>
-          <w:tcPr>
-            <w:tcW w:type="dxa" w:w="3118"/>
-            <w:shd w:val="clear" w:color="auto" w:fill="FFFFFF"/>
-          </w:tcPr>
-          <w:p>
-            <w:pPr>
-              <w:spacing w:before="60" w:after="60"/>
-            </w:pPr>
-            <w:r>
-              <w:rPr>
-                <w:color w:val="444444"/>
-                <w:sz w:val="19"/>
-              </w:rPr>
-              <w:t>Revenue by week and month</w:t>
-            </w:r>
-          </w:p>
-        </w:tc>
-        <w:tc>
-          <w:tcPr>
-            <w:tcW w:type="dxa" w:w="1417"/>
-            <w:shd w:val="clear" w:color="auto" w:fill="FFFFFF"/>
-          </w:tcPr>
-          <w:p>
-            <w:pPr>
-              <w:spacing w:before="60" w:after="60"/>
-            </w:pPr>
-            <w:r>
-              <w:rPr>
-                <w:b w:val="0"/>
-                <w:color w:val="996B00"/>
-                <w:sz w:val="19"/>
-              </w:rPr>
-              <w:t>Partial</w:t>
-            </w:r>
-          </w:p>
-        </w:tc>
-        <w:tc>
-          <w:tcPr>
-            <w:tcW w:type="dxa" w:w="4535"/>
-            <w:shd w:val="clear" w:color="auto" w:fill="FFFFFF"/>
-          </w:tcPr>
-          <w:p>
-            <w:pPr>
-              <w:spacing w:before="60" w:after="60"/>
-            </w:pPr>
-            <w:r>
-              <w:rPr>
-                <w:color w:val="444444"/>
-                <w:sz w:val="19"/>
-              </w:rPr>
-              <w:t>Weekly on Trends tab; no daily; monthly via period selector</w:t>
-            </w:r>
-          </w:p>
-        </w:tc>
-      </w:tr>
-      <w:tr>
-        <w:tc>
-          <w:tcPr>
-            <w:tcW w:type="dxa" w:w="3118"/>
-            <w:shd w:val="clear" w:color="auto" w:fill="F7F7F7"/>
-          </w:tcPr>
-          <w:p>
-            <w:pPr>
-              <w:spacing w:before="60" w:after="60"/>
-            </w:pPr>
-            <w:r>
-              <w:rPr>
-                <w:color w:val="444444"/>
-                <w:sz w:val="19"/>
-              </w:rPr>
-              <w:t>Fastest/slowest movers</w:t>
-            </w:r>
-          </w:p>
-        </w:tc>
-        <w:tc>
-          <w:tcPr>
-            <w:tcW w:type="dxa" w:w="1417"/>
-            <w:shd w:val="clear" w:color="auto" w:fill="F7F7F7"/>
-          </w:tcPr>
-          <w:p>
-            <w:pPr>
-              <w:spacing w:before="60" w:after="60"/>
-            </w:pPr>
-            <w:r>
-              <w:rPr>
-                <w:b w:val="0"/>
-                <w:color w:val="996B00"/>
-                <w:sz w:val="19"/>
-              </w:rPr>
-              <w:t>Partial</w:t>
-            </w:r>
-          </w:p>
-        </w:tc>
-        <w:tc>
-          <w:tcPr>
-            <w:tcW w:type="dxa" w:w="4535"/>
-            <w:shd w:val="clear" w:color="auto" w:fill="F7F7F7"/>
-          </w:tcPr>
-          <w:p>
-            <w:pPr>
-              <w:spacing w:before="60" w:after="60"/>
-            </w:pPr>
-            <w:r>
-              <w:rPr>
-                <w:color w:val="444444"/>
-                <w:sz w:val="19"/>
-              </w:rPr>
-              <w:t>Velocity badges in Top Sellers; not on primary view</w:t>
-            </w:r>
-          </w:p>
-        </w:tc>
-      </w:tr>
-      <w:tr>
-        <w:tc>
-          <w:tcPr>
-            <w:tcW w:type="dxa" w:w="3118"/>
-            <w:shd w:val="clear" w:color="auto" w:fill="FFFFFF"/>
-          </w:tcPr>
-          <w:p>
-            <w:pPr>
-              <w:spacing w:before="60" w:after="60"/>
-            </w:pPr>
-            <w:r>
-              <w:rPr>
-                <w:color w:val="444444"/>
-                <w:sz w:val="19"/>
-              </w:rPr>
-              <w:t>Reorder alerts</w:t>
-            </w:r>
-          </w:p>
-        </w:tc>
-        <w:tc>
-          <w:tcPr>
-            <w:tcW w:type="dxa" w:w="1417"/>
-            <w:shd w:val="clear" w:color="auto" w:fill="FFFFFF"/>
-          </w:tcPr>
-          <w:p>
-            <w:pPr>
-              <w:spacing w:before="60" w:after="60"/>
-            </w:pPr>
-            <w:r>
-              <w:rPr>
-                <w:b w:val="0"/>
-                <w:color w:val="1A7A3C"/>
-                <w:sz w:val="19"/>
-              </w:rPr>
-              <w:t>Present</w:t>
-            </w:r>
-          </w:p>
-        </w:tc>
-        <w:tc>
-          <w:tcPr>
-            <w:tcW w:type="dxa" w:w="4535"/>
-            <w:shd w:val="clear" w:color="auto" w:fill="FFFFFF"/>
-          </w:tcPr>
-          <w:p>
-            <w:pPr>
-              <w:spacing w:before="60" w:after="60"/>
-            </w:pPr>
-            <w:r>
-              <w:rPr>
-                <w:color w:val="444444"/>
-                <w:sz w:val="19"/>
-              </w:rPr>
-              <w:t>Order Prediction — well executed</w:t>
-            </w:r>
-          </w:p>
-        </w:tc>
-      </w:tr>
-      <w:tr>
-        <w:tc>
-          <w:tcPr>
-            <w:tcW w:type="dxa" w:w="3118"/>
-            <w:shd w:val="clear" w:color="auto" w:fill="F7F7F7"/>
-          </w:tcPr>
-          <w:p>
-            <w:pPr>
-              <w:spacing w:before="60" w:after="60"/>
-            </w:pPr>
-            <w:r>
-              <w:rPr>
-                <w:color w:val="444444"/>
-                <w:sz w:val="19"/>
-              </w:rPr>
-              <w:t>Gross profit %</w:t>
-            </w:r>
-          </w:p>
-        </w:tc>
-        <w:tc>
-          <w:tcPr>
-            <w:tcW w:type="dxa" w:w="1417"/>
-            <w:shd w:val="clear" w:color="auto" w:fill="F7F7F7"/>
-          </w:tcPr>
-          <w:p>
-            <w:pPr>
-              <w:spacing w:before="60" w:after="60"/>
-            </w:pPr>
-            <w:r>
-              <w:rPr>
-                <w:b w:val="0"/>
-                <w:color w:val="996B00"/>
-                <w:sz w:val="19"/>
-              </w:rPr>
-              <w:t>Partial</w:t>
-            </w:r>
-          </w:p>
-        </w:tc>
-        <w:tc>
-          <w:tcPr>
-            <w:tcW w:type="dxa" w:w="4535"/>
-            <w:shd w:val="clear" w:color="auto" w:fill="F7F7F7"/>
-          </w:tcPr>
-          <w:p>
-            <w:pPr>
-              <w:spacing w:before="60" w:after="60"/>
-            </w:pPr>
-            <w:r>
-              <w:rPr>
-                <w:color w:val="444444"/>
-                <w:sz w:val="19"/>
-              </w:rPr>
-              <w:t>Present in Stock History; data-dependent on cost entry</w:t>
-            </w:r>
-          </w:p>
-        </w:tc>
-      </w:tr>
-      <w:tr>
-        <w:tc>
-          <w:tcPr>
-            <w:tcW w:type="dxa" w:w="3118"/>
-            <w:shd w:val="clear" w:color="auto" w:fill="FFFFFF"/>
-          </w:tcPr>
-          <w:p>
-            <w:pPr>
-              <w:spacing w:before="60" w:after="60"/>
-            </w:pPr>
-            <w:r>
-              <w:rPr>
-                <w:color w:val="444444"/>
-                <w:sz w:val="19"/>
-              </w:rPr>
-              <w:t>Physical stock reconciliation</w:t>
-            </w:r>
-          </w:p>
-        </w:tc>
-        <w:tc>
-          <w:tcPr>
-            <w:tcW w:type="dxa" w:w="1417"/>
-            <w:shd w:val="clear" w:color="auto" w:fill="FFFFFF"/>
-          </w:tcPr>
-          <w:p>
-            <w:pPr>
-              <w:spacing w:before="60" w:after="60"/>
-            </w:pPr>
-            <w:r>
-              <w:rPr>
-                <w:b/>
-                <w:color w:val="C0392B"/>
-                <w:sz w:val="19"/>
-              </w:rPr>
-              <w:t>Missing</w:t>
-            </w:r>
-          </w:p>
-        </w:tc>
-        <w:tc>
-          <w:tcPr>
-            <w:tcW w:type="dxa" w:w="4535"/>
-            <w:shd w:val="clear" w:color="auto" w:fill="FFFFFF"/>
-          </w:tcPr>
-          <w:p>
-            <w:pPr>
-              <w:spacing w:before="60" w:after="60"/>
-            </w:pPr>
-            <w:r>
-              <w:rPr>
-                <w:color w:val="444444"/>
-                <w:sz w:val="19"/>
-              </w:rPr>
-              <w:t>Database table existed; no UI</w:t>
-            </w:r>
-          </w:p>
-        </w:tc>
-      </w:tr>
-    </w:tbl>
-    <w:p>
-      <w:pPr>
-        <w:spacing w:after="40"/>
-      </w:pPr>
-    </w:p>
-    <w:tbl>
-      <w:tblPr>
-        <w:tblW w:type="auto" w:w="0"/>
-        <w:jc w:val="left"/>
-        <w:tblLook w:firstColumn="1" w:firstRow="1" w:lastColumn="0" w:lastRow="0" w:noHBand="0" w:noVBand="1" w:val="04A0"/>
-      </w:tblPr>
-      <w:tblGrid>
-        <w:gridCol w:w="9122"/>
-      </w:tblGrid>
-      <w:tr>
-        <w:tc>
-          <w:tcPr>
-            <w:tcW w:type="dxa" w:w="8352"/>
-            <w:shd w:val="clear" w:color="auto" w:fill="FFF8F0"/>
-            <w:tcBorders>
-              <w:top w:val="none" w:sz="4" w:space="0" w:color="auto"/>
-              <w:left w:val="single" w:sz="16" w:space="0" w:color="E8C547"/>
-              <w:bottom w:val="none" w:sz="4" w:space="0" w:color="auto"/>
-              <w:right w:val="none" w:sz="4" w:space="0" w:color="auto"/>
-            </w:tcBorders>
-          </w:tcPr>
-          <w:p>
-            <w:pPr>
-              <w:spacing w:before="120" w:after="120"/>
-            </w:pPr>
-            <w:r>
-              <w:rPr>
-                <w:color w:val="444444"/>
-                <w:sz w:val="20"/>
-              </w:rPr>
-              <w:t>Overall coverage against benchmark criteria: approximately 60–65%. The velocity and reorder engine was the standout component. The main gaps were on the reporting side — sell-through rate, overstocked flagging, and physical stock count integration.</w:t>
-            </w:r>
-          </w:p>
-        </w:tc>
-      </w:tr>
-    </w:tbl>
-    <w:p>
-      <w:pPr>
-        <w:spacing w:after="80"/>
-      </w:pPr>
     </w:p>
     <w:p/>
     <w:p>
@@ -2401,20 +1807,7 @@
           <w:color w:val="888888"/>
           <w:sz w:val="20"/>
         </w:rPr>
-        <w:t>5. THE REDESIGN — PROPOSED FOUR-TAB STRUCTURE</w:t>
-      </w:r>
-    </w:p>
-    <w:p>
-      <w:pPr>
-        <w:spacing w:before="200" w:after="120"/>
-      </w:pPr>
-      <w:r>
-        <w:rPr>
-          <w:b/>
-          <w:color w:val="111111"/>
-          <w:sz w:val="26"/>
-        </w:rPr>
-        <w:t>Organising Principle</w:t>
+        <w:t>5. THE REDESIGN — FOUR-TAB STRUCTURE</w:t>
       </w:r>
     </w:p>
     <w:p>
@@ -2426,7 +1819,7 @@
           <w:color w:val="444444"/>
           <w:sz w:val="21"/>
         </w:rPr>
-        <w:t>The redesign is structured around four sequential questions a manager asks when reviewing the business. Each tab answers exactly one question, with no overlap between them.</w:t>
+        <w:t>The redesign consolidates five tabs into four, each serving a single purpose with no overlap. Three tabs are replaced or merged; Order Prediction is carried over unchanged with a corrected position in the tab sequence.</w:t>
       </w:r>
     </w:p>
     <w:tbl>
@@ -2464,7 +1857,7 @@
         </w:tc>
         <w:tc>
           <w:tcPr>
-            <w:tcW w:type="dxa" w:w="2154"/>
+            <w:tcW w:type="dxa" w:w="2268"/>
             <w:shd w:val="clear" w:color="auto" w:fill="111111"/>
           </w:tcPr>
           <w:p>
@@ -2483,26 +1876,7 @@
         </w:tc>
         <w:tc>
           <w:tcPr>
-            <w:tcW w:type="dxa" w:w="2721"/>
-            <w:shd w:val="clear" w:color="auto" w:fill="111111"/>
-          </w:tcPr>
-          <w:p>
-            <w:pPr>
-              <w:spacing w:before="80" w:after="80"/>
-            </w:pPr>
-            <w:r>
-              <w:rPr>
-                <w:b/>
-                <w:color w:val="FFFFFF"/>
-                <w:sz w:val="18"/>
-              </w:rPr>
-              <w:t>QUESTION ANSWERED</w:t>
-            </w:r>
-          </w:p>
-        </w:tc>
-        <w:tc>
-          <w:tcPr>
-            <w:tcW w:type="dxa" w:w="2835"/>
+            <w:tcW w:type="dxa" w:w="2948"/>
             <w:shd w:val="clear" w:color="auto" w:fill="111111"/>
           </w:tcPr>
           <w:p>
@@ -2516,6 +1890,25 @@
                 <w:sz w:val="18"/>
               </w:rPr>
               <w:t>REPLACES</w:t>
+            </w:r>
+          </w:p>
+        </w:tc>
+        <w:tc>
+          <w:tcPr>
+            <w:tcW w:type="dxa" w:w="3402"/>
+            <w:shd w:val="clear" w:color="auto" w:fill="111111"/>
+          </w:tcPr>
+          <w:p>
+            <w:pPr>
+              <w:spacing w:before="80" w:after="80"/>
+            </w:pPr>
+            <w:r>
+              <w:rPr>
+                <w:b/>
+                <w:color w:val="FFFFFF"/>
+                <w:sz w:val="18"/>
+              </w:rPr>
+              <w:t>NEW OR CHANGED?</w:t>
             </w:r>
           </w:p>
         </w:tc>
@@ -2541,7 +1934,7 @@
         </w:tc>
         <w:tc>
           <w:tcPr>
-            <w:tcW w:type="dxa" w:w="2154"/>
+            <w:tcW w:type="dxa" w:w="2268"/>
             <w:shd w:val="clear" w:color="auto" w:fill="FFFFFF"/>
           </w:tcPr>
           <w:p>
@@ -2559,25 +1952,7 @@
         </w:tc>
         <w:tc>
           <w:tcPr>
-            <w:tcW w:type="dxa" w:w="2721"/>
-            <w:shd w:val="clear" w:color="auto" w:fill="FFFFFF"/>
-          </w:tcPr>
-          <w:p>
-            <w:pPr>
-              <w:spacing w:before="60" w:after="60"/>
-            </w:pPr>
-            <w:r>
-              <w:rPr>
-                <w:color w:val="444444"/>
-                <w:sz w:val="19"/>
-              </w:rPr>
-              <w:t>What sold this week?</w:t>
-            </w:r>
-          </w:p>
-        </w:tc>
-        <w:tc>
-          <w:tcPr>
-            <w:tcW w:type="dxa" w:w="2835"/>
+            <w:tcW w:type="dxa" w:w="2948"/>
             <w:shd w:val="clear" w:color="auto" w:fill="FFFFFF"/>
           </w:tcPr>
           <w:p>
@@ -2590,6 +1965,24 @@
                 <w:sz w:val="19"/>
               </w:rPr>
               <w:t>Overview + Top Sellers</w:t>
+            </w:r>
+          </w:p>
+        </w:tc>
+        <w:tc>
+          <w:tcPr>
+            <w:tcW w:type="dxa" w:w="3402"/>
+            <w:shd w:val="clear" w:color="auto" w:fill="FFFFFF"/>
+          </w:tcPr>
+          <w:p>
+            <w:pPr>
+              <w:spacing w:before="60" w:after="60"/>
+            </w:pPr>
+            <w:r>
+              <w:rPr>
+                <w:color w:val="444444"/>
+                <w:sz w:val="19"/>
+              </w:rPr>
+              <w:t>New — week navigation, health strip, days-left column</w:t>
             </w:r>
           </w:p>
         </w:tc>
@@ -2615,7 +2008,7 @@
         </w:tc>
         <w:tc>
           <w:tcPr>
-            <w:tcW w:type="dxa" w:w="2154"/>
+            <w:tcW w:type="dxa" w:w="2268"/>
             <w:shd w:val="clear" w:color="auto" w:fill="F7F7F7"/>
           </w:tcPr>
           <w:p>
@@ -2633,25 +2026,7 @@
         </w:tc>
         <w:tc>
           <w:tcPr>
-            <w:tcW w:type="dxa" w:w="2721"/>
-            <w:shd w:val="clear" w:color="auto" w:fill="F7F7F7"/>
-          </w:tcPr>
-          <w:p>
-            <w:pPr>
-              <w:spacing w:before="60" w:after="60"/>
-            </w:pPr>
-            <w:r>
-              <w:rPr>
-                <w:color w:val="444444"/>
-                <w:sz w:val="19"/>
-              </w:rPr>
-              <w:t>What stock do we have?</w:t>
-            </w:r>
-          </w:p>
-        </w:tc>
-        <w:tc>
-          <w:tcPr>
-            <w:tcW w:type="dxa" w:w="2835"/>
+            <w:tcW w:type="dxa" w:w="2948"/>
             <w:shd w:val="clear" w:color="auto" w:fill="F7F7F7"/>
           </w:tcPr>
           <w:p>
@@ -2664,6 +2039,24 @@
                 <w:sz w:val="19"/>
               </w:rPr>
               <w:t>Stock History (operational rows)</w:t>
+            </w:r>
+          </w:p>
+        </w:tc>
+        <w:tc>
+          <w:tcPr>
+            <w:tcW w:type="dxa" w:w="3402"/>
+            <w:shd w:val="clear" w:color="auto" w:fill="F7F7F7"/>
+          </w:tcPr>
+          <w:p>
+            <w:pPr>
+              <w:spacing w:before="60" w:after="60"/>
+            </w:pPr>
+            <w:r>
+              <w:rPr>
+                <w:color w:val="444444"/>
+                <w:sz w:val="19"/>
+              </w:rPr>
+              <w:t>New — physical count entry, monthly variance summary</w:t>
             </w:r>
           </w:p>
         </w:tc>
@@ -2689,7 +2082,7 @@
         </w:tc>
         <w:tc>
           <w:tcPr>
-            <w:tcW w:type="dxa" w:w="2154"/>
+            <w:tcW w:type="dxa" w:w="2268"/>
             <w:shd w:val="clear" w:color="auto" w:fill="FFFFFF"/>
           </w:tcPr>
           <w:p>
@@ -2707,7 +2100,7 @@
         </w:tc>
         <w:tc>
           <w:tcPr>
-            <w:tcW w:type="dxa" w:w="2721"/>
+            <w:tcW w:type="dxa" w:w="2948"/>
             <w:shd w:val="clear" w:color="auto" w:fill="FFFFFF"/>
           </w:tcPr>
           <w:p>
@@ -2719,13 +2112,13 @@
                 <w:color w:val="444444"/>
                 <w:sz w:val="19"/>
               </w:rPr>
-              <w:t>What needs reordering?</w:t>
+              <w:t>Order Prediction</w:t>
             </w:r>
           </w:p>
         </w:tc>
         <w:tc>
           <w:tcPr>
-            <w:tcW w:type="dxa" w:w="2835"/>
+            <w:tcW w:type="dxa" w:w="3402"/>
             <w:shd w:val="clear" w:color="auto" w:fill="FFFFFF"/>
           </w:tcPr>
           <w:p>
@@ -2737,7 +2130,7 @@
                 <w:color w:val="444444"/>
                 <w:sz w:val="19"/>
               </w:rPr>
-              <w:t>Order Prediction (unchanged)</w:t>
+              <w:t>Unchanged — position corrected to follow reconciliation</w:t>
             </w:r>
           </w:p>
         </w:tc>
@@ -2763,7 +2156,7 @@
         </w:tc>
         <w:tc>
           <w:tcPr>
-            <w:tcW w:type="dxa" w:w="2154"/>
+            <w:tcW w:type="dxa" w:w="2268"/>
             <w:shd w:val="clear" w:color="auto" w:fill="F7F7F7"/>
           </w:tcPr>
           <w:p>
@@ -2781,7 +2174,7 @@
         </w:tc>
         <w:tc>
           <w:tcPr>
-            <w:tcW w:type="dxa" w:w="2721"/>
+            <w:tcW w:type="dxa" w:w="2948"/>
             <w:shd w:val="clear" w:color="auto" w:fill="F7F7F7"/>
           </w:tcPr>
           <w:p>
@@ -2793,13 +2186,13 @@
                 <w:color w:val="444444"/>
                 <w:sz w:val="19"/>
               </w:rPr>
-              <w:t>How are we performing?</w:t>
+              <w:t>Trends + Stock History (GP% data)</w:t>
             </w:r>
           </w:p>
         </w:tc>
         <w:tc>
           <w:tcPr>
-            <w:tcW w:type="dxa" w:w="2835"/>
+            <w:tcW w:type="dxa" w:w="3402"/>
             <w:shd w:val="clear" w:color="auto" w:fill="F7F7F7"/>
           </w:tcPr>
           <w:p>
@@ -2811,7 +2204,7 @@
                 <w:color w:val="444444"/>
                 <w:sz w:val="19"/>
               </w:rPr>
-              <w:t>Trends + Stock History (GP data)</w:t>
+              <w:t>Merged — revenue chart and GP table in one monthly view</w:t>
             </w:r>
           </w:p>
         </w:tc>
@@ -2824,7 +2217,7 @@
     </w:p>
     <w:p>
       <w:pPr>
-        <w:spacing w:before="200" w:after="120"/>
+        <w:spacing w:before="240" w:after="120"/>
       </w:pPr>
       <w:r>
         <w:rPr>
@@ -2844,19 +2237,21 @@
           <w:color w:val="444444"/>
           <w:sz w:val="21"/>
         </w:rPr>
-        <w:t>The default landing tab. Replaces the old Overview and absorbs the Top Sellers product hierarchy. The primary user is someone opening the dashboard at the start or end of the week to understand what traded and whether anything needs immediate attention.</w:t>
+        <w:t>Default landing screen. Primary audience: anyone opening the dashboard to understand the current week.</w:t>
       </w:r>
     </w:p>
     <w:p>
       <w:pPr>
-        <w:spacing w:after="120"/>
+        <w:pStyle w:val="ListBullet"/>
+        <w:spacing w:after="60"/>
+        <w:ind w:left="340"/>
       </w:pPr>
       <w:r>
         <w:rPr>
           <w:color w:val="444444"/>
           <w:sz w:val="21"/>
         </w:rPr>
-        <w:t>Key elements:</w:t>
+        <w:t>Week navigation (arrows + dropdown) — moves between any week in the dataset.</w:t>
       </w:r>
     </w:p>
     <w:p>
@@ -2870,7 +2265,7 @@
           <w:color w:val="444444"/>
           <w:sz w:val="21"/>
         </w:rPr>
-        <w:t>Week navigation arrows and a dropdown to move between weeks.</w:t>
+        <w:t>Stock health strip — four count badges (Order Now / Order Soon / Healthy / Excess), each linking to Order Prediction pre-filtered to that status.</w:t>
       </w:r>
     </w:p>
     <w:p>
@@ -2884,7 +2279,7 @@
           <w:color w:val="444444"/>
           <w:sz w:val="21"/>
         </w:rPr>
-        <w:t>Stock health summary strip: four count badges (Order Now / Order Soon / Healthy / Excess Stock), each linking directly to the Order Prediction tab pre-filtered to that status.</w:t>
+        <w:t>Per-category KPI cards — units, revenue, and week-on-week % change for Coffee, Shakes, Bars &amp; Snacks, Functional Drinks, Merch.</w:t>
       </w:r>
     </w:p>
     <w:p>
@@ -2898,7 +2293,7 @@
           <w:color w:val="444444"/>
           <w:sz w:val="21"/>
         </w:rPr>
-        <w:t>Per-category KPI cards (Coffee, Shakes, Bars &amp; Snacks, Functional Drinks, Merch) showing units sold, revenue, and week-on-week percentage change.</w:t>
+        <w:t>Product table — grouped by brand, expandable to product level, sortable by units or revenue. Columns: Product, Category, Units Sold, Revenue, Days Left, Current Stock.</w:t>
       </w:r>
     </w:p>
     <w:p>
@@ -2912,26 +2307,12 @@
           <w:color w:val="444444"/>
           <w:sz w:val="21"/>
         </w:rPr>
-        <w:t>Product table grouped by brand and expandable to product level, sorted by units sold or revenue. Includes a Days Left column (from the velocity calculation) and a Current Stock column.</w:t>
+        <w:t>Category filter (All Café, sub-categories, All Merch).</w:t>
       </w:r>
     </w:p>
     <w:p>
       <w:pPr>
-        <w:pStyle w:val="ListBullet"/>
-        <w:spacing w:after="60"/>
-        <w:ind w:left="340"/>
-      </w:pPr>
-      <w:r>
-        <w:rPr>
-          <w:color w:val="444444"/>
-          <w:sz w:val="21"/>
-        </w:rPr>
-        <w:t>Category and segment filters (All Café, individual categories, All Merch).</w:t>
-      </w:r>
-    </w:p>
-    <w:p>
-      <w:pPr>
-        <w:spacing w:before="200" w:after="120"/>
+        <w:spacing w:before="240" w:after="120"/>
       </w:pPr>
       <w:r>
         <w:rPr>
@@ -2951,19 +2332,7 @@
           <w:color w:val="444444"/>
           <w:sz w:val="21"/>
         </w:rPr>
-        <w:t>A new tab with no direct equivalent in the previous design. This is the connection between the theoretical stock position (calculated from deliveries minus sales) and the physical reality on the shelf. It is intended for use on a monthly cadence rather than weekly.</w:t>
-      </w:r>
-    </w:p>
-    <w:p>
-      <w:pPr>
-        <w:spacing w:after="120"/>
-      </w:pPr>
-      <w:r>
-        <w:rPr>
-          <w:color w:val="444444"/>
-          <w:sz w:val="21"/>
-        </w:rPr>
-        <w:t>Key elements:</w:t>
+        <w:t>Physical stock reality check. Intended for monthly use, not weekly. Covers bought-in products only.</w:t>
       </w:r>
     </w:p>
     <w:p>
@@ -2991,7 +2360,7 @@
           <w:color w:val="444444"/>
           <w:sz w:val="21"/>
         </w:rPr>
-        <w:t>Per-product reconciliation table: Opening Balance → + Deliveries → − Sold → = Theoretical → Closing Count (click to enter) → Variance.</w:t>
+        <w:t>Per-product flow table: Opening Balance → + Deliveries → − Sold → = Theoretical → Closing Count → Variance.</w:t>
       </w:r>
     </w:p>
     <w:p>
@@ -3005,7 +2374,7 @@
           <w:color w:val="444444"/>
           <w:sz w:val="21"/>
         </w:rPr>
-        <w:t>Opening balance automatically chains from the previous week's closing count.</w:t>
+        <w:t>Opening balance chains automatically from the previous week's entered count.</w:t>
       </w:r>
     </w:p>
     <w:p>
@@ -3019,7 +2388,7 @@
           <w:color w:val="444444"/>
           <w:sz w:val="21"/>
         </w:rPr>
-        <w:t>Inline count entry: clicking a Closing Balance cell opens a popover with a number input and an optional notes field.</w:t>
+        <w:t>Closing count entry — click any cell to open a popover input with an optional notes field.</w:t>
       </w:r>
     </w:p>
     <w:p>
@@ -3033,21 +2402,7 @@
           <w:color w:val="444444"/>
           <w:sz w:val="21"/>
         </w:rPr>
-        <w:t>Monthly variance summary below the week table: aggregates variances across all weeks in a month where counts were entered, showing total shrinkage or surplus per product.</w:t>
-      </w:r>
-    </w:p>
-    <w:p>
-      <w:pPr>
-        <w:pStyle w:val="ListBullet"/>
-        <w:spacing w:after="60"/>
-        <w:ind w:left="340"/>
-      </w:pPr>
-      <w:r>
-        <w:rPr>
-          <w:color w:val="444444"/>
-          <w:sz w:val="21"/>
-        </w:rPr>
-        <w:t>Café / Merch segment toggle. In-house products (coffee, house-made shakes) are excluded — consistent with the Order Prediction exclusion logic.</w:t>
+        <w:t>Monthly variance summary — aggregates all weeks with entered counts; shows total variance per product and month total.</w:t>
       </w:r>
     </w:p>
     <w:tbl>
@@ -3080,7 +2435,7 @@
                 <w:color w:val="444444"/>
                 <w:sz w:val="20"/>
               </w:rPr>
-              <w:t>The shop_stock_takes table for storing physical counts already existed in the Supabase database before the redesign. It had zero rows — the infrastructure was in place but had never been connected to a UI. This tab completes that connection.</w:t>
+              <w:t>The database table for physical counts (shop_stock_takes) already existed in Supabase with zero rows. This tab connects the UI to that table for the first time.</w:t>
             </w:r>
           </w:p>
         </w:tc>
@@ -3093,7 +2448,7 @@
     </w:p>
     <w:p>
       <w:pPr>
-        <w:spacing w:before="200" w:after="120"/>
+        <w:spacing w:before="240" w:after="120"/>
       </w:pPr>
       <w:r>
         <w:rPr>
@@ -3113,19 +2468,21 @@
           <w:color w:val="444444"/>
           <w:sz w:val="21"/>
         </w:rPr>
-        <w:t>Carried over unchanged from the previous design. This is the strongest component of the original dashboard and required no structural changes — only a correction to its position in the tab order (previously tab 2; correctly tab 3, after reconciliation).</w:t>
+        <w:t>Velocity-driven reorder decisions. Unchanged from the previous design; position corrected to follow Stock Reconciliation.</w:t>
       </w:r>
     </w:p>
     <w:p>
       <w:pPr>
-        <w:spacing w:after="120"/>
+        <w:pStyle w:val="ListBullet"/>
+        <w:spacing w:after="60"/>
+        <w:ind w:left="340"/>
       </w:pPr>
       <w:r>
         <w:rPr>
           <w:color w:val="444444"/>
           <w:sz w:val="21"/>
         </w:rPr>
-        <w:t>Retained features:</w:t>
+        <w:t>Velocity = average units sold per week over the last four weeks.</w:t>
       </w:r>
     </w:p>
     <w:p>
@@ -3139,7 +2496,7 @@
           <w:color w:val="444444"/>
           <w:sz w:val="21"/>
         </w:rPr>
-        <w:t>Velocity-based covers calculation: average units per week over the last four weeks, expressed as days of stock remaining.</w:t>
+        <w:t>Estimated stock = last delivery quantity minus units sold since that delivery.</w:t>
       </w:r>
     </w:p>
     <w:p>
@@ -3153,7 +2510,7 @@
           <w:color w:val="444444"/>
           <w:sz w:val="21"/>
         </w:rPr>
-        <w:t>Visual covers bar (colour-coded by urgency) per product row.</w:t>
+        <w:t>Days of cover = estimated stock ÷ weekly velocity × 7.</w:t>
       </w:r>
     </w:p>
     <w:p>
@@ -3181,7 +2538,7 @@
           <w:color w:val="444444"/>
           <w:sz w:val="21"/>
         </w:rPr>
-        <w:t>Suggested order quantity based on cycle length (2 weeks for café, 8 weeks for merch).</w:t>
+        <w:t>Suggested order quantity covering the next full cycle (2 weeks for café, 8 weeks for merch).</w:t>
       </w:r>
     </w:p>
     <w:p>
@@ -3195,40 +2552,12 @@
           <w:color w:val="444444"/>
           <w:sz w:val="21"/>
         </w:rPr>
-        <w:t>Tab badge showing the live "Order Now" count — visible from any tab.</w:t>
+        <w:t>Live tab badge showing the current Order Now count.</w:t>
       </w:r>
     </w:p>
     <w:p>
       <w:pPr>
-        <w:pStyle w:val="ListBullet"/>
-        <w:spacing w:after="60"/>
-        <w:ind w:left="340"/>
-      </w:pPr>
-      <w:r>
-        <w:rPr>
-          <w:color w:val="444444"/>
-          <w:sz w:val="21"/>
-        </w:rPr>
-        <w:t>Minimum stock unit override per product (from the product lookup table).</w:t>
-      </w:r>
-    </w:p>
-    <w:p>
-      <w:pPr>
-        <w:pStyle w:val="ListBullet"/>
-        <w:spacing w:after="60"/>
-        <w:ind w:left="340"/>
-      </w:pPr>
-      <w:r>
-        <w:rPr>
-          <w:color w:val="444444"/>
-          <w:sz w:val="21"/>
-        </w:rPr>
-        <w:t>Café / Merch segment toggle and status filter (All / Order Now / Order Soon / Sufficient).</w:t>
-      </w:r>
-    </w:p>
-    <w:p>
-      <w:pPr>
-        <w:spacing w:before="200" w:after="120"/>
+        <w:spacing w:before="240" w:after="120"/>
       </w:pPr>
       <w:r>
         <w:rPr>
@@ -3248,19 +2577,21 @@
           <w:color w:val="444444"/>
           <w:sz w:val="21"/>
         </w:rPr>
-        <w:t>A consolidated monthly review tab, merging the old Trends chart with the gross profit data from Stock History. Intended for management review rather than daily operational use.</w:t>
+        <w:t>Monthly management review. Revenue trend and gross profit — not for daily operational use.</w:t>
       </w:r>
     </w:p>
     <w:p>
       <w:pPr>
-        <w:spacing w:after="120"/>
+        <w:pStyle w:val="ListBullet"/>
+        <w:spacing w:after="60"/>
+        <w:ind w:left="340"/>
       </w:pPr>
       <w:r>
         <w:rPr>
           <w:color w:val="444444"/>
           <w:sz w:val="21"/>
         </w:rPr>
-        <w:t>Key elements:</w:t>
+        <w:t>Weekly revenue by category — line chart, all historical weeks, per-category toggle.</w:t>
       </w:r>
     </w:p>
     <w:p>
@@ -3274,21 +2605,7 @@
           <w:color w:val="444444"/>
           <w:sz w:val="21"/>
         </w:rPr>
-        <w:t>Weekly revenue by category — stacked line chart showing all historical weeks, with per-category toggle.</w:t>
-      </w:r>
-    </w:p>
-    <w:p>
-      <w:pPr>
-        <w:pStyle w:val="ListBullet"/>
-        <w:spacing w:after="60"/>
-        <w:ind w:left="340"/>
-      </w:pPr>
-      <w:r>
-        <w:rPr>
-          <w:color w:val="444444"/>
-          <w:sz w:val="21"/>
-        </w:rPr>
-        <w:t>Gross profit table by product with month picker: Product, Category, Units Sold, Revenue, COGS, GP%.</w:t>
+        <w:t>Gross profit table by product — month picker, columns: Product, Units Sold, Revenue, COGS, GP%.</w:t>
       </w:r>
     </w:p>
     <w:p>
@@ -3303,20 +2620,6 @@
           <w:sz w:val="21"/>
         </w:rPr>
         <w:t>Month-total GP% in the table footer.</w:t>
-      </w:r>
-    </w:p>
-    <w:p>
-      <w:pPr>
-        <w:pStyle w:val="ListBullet"/>
-        <w:spacing w:after="60"/>
-        <w:ind w:left="340"/>
-      </w:pPr>
-      <w:r>
-        <w:rPr>
-          <w:color w:val="444444"/>
-          <w:sz w:val="21"/>
-        </w:rPr>
-        <w:t>Cost price editing accessible from this tab (as it was from Stock History).</w:t>
       </w:r>
     </w:p>
     <w:p/>
@@ -3346,7 +2649,7 @@
           <w:color w:val="444444"/>
           <w:sz w:val="21"/>
         </w:rPr>
-        <w:t>Two prototype files were produced during the planning phase. Neither is connected to the live Supabase database — both use static mock data for layout and interaction validation.</w:t>
+        <w:t>Two prototype files were produced to validate layout and interactions before committing to building against live data. Both use static mock data.</w:t>
       </w:r>
     </w:p>
     <w:p>
@@ -3359,7 +2662,7 @@
           <w:color w:val="111111"/>
           <w:sz w:val="26"/>
         </w:rPr>
-        <w:t>Iteration 1 — prototype.html</w:t>
+        <w:t>Iteration 1 — Early Layout</w:t>
       </w:r>
     </w:p>
     <w:p>
@@ -3371,7 +2674,7 @@
           <w:color w:val="444444"/>
           <w:sz w:val="21"/>
         </w:rPr>
-        <w:t>An early-stage layout exploration. Introduced the concept of a dark-theme dashboard matching the ONE LDN brand aesthetic, and established the core visual language: category colour coding (red for coffee, gold for shakes, green for functional drinks, blue for merch), KPI card format, and the covers bar visualisation from Order Prediction. This file served as the visual foundation but did not yet define the tab structure.</w:t>
+        <w:t>Established the visual language: dark theme matching the ONE LDN aesthetic, category colour coding (red for coffee, gold for shakes, green for functional drinks, blue for merch), KPI card format, and the covers bar in Order Prediction. No tab structure was finalised at this stage.</w:t>
       </w:r>
     </w:p>
     <w:p>
@@ -3384,7 +2687,7 @@
           <w:color w:val="111111"/>
           <w:sz w:val="26"/>
         </w:rPr>
-        <w:t>Iteration 2 — prototype-structure.html</w:t>
+        <w:t>Iteration 2 — Structure Prototype</w:t>
       </w:r>
     </w:p>
     <w:p>
@@ -3396,7 +2699,7 @@
           <w:color w:val="444444"/>
           <w:sz w:val="21"/>
         </w:rPr>
-        <w:t>The primary structure prototype. Built to validate the four-tab layout, week navigation, expandable brand table, stock reconciliation flow, and the Finance chart. Key interactions implemented in static JavaScript:</w:t>
+        <w:t>The four-tab structure prototype, built to validate layout and key interactions. All core flows were made interactive using static JavaScript:</w:t>
       </w:r>
     </w:p>
     <w:p>
@@ -3410,7 +2713,7 @@
           <w:color w:val="444444"/>
           <w:sz w:val="21"/>
         </w:rPr>
-        <w:t>Week-by-week navigation using prev/next arrows and a dropdown selector.</w:t>
+        <w:t>Week-by-week navigation with prev/next arrows and a dropdown.</w:t>
       </w:r>
     </w:p>
     <w:p>
@@ -3424,7 +2727,7 @@
           <w:color w:val="444444"/>
           <w:sz w:val="21"/>
         </w:rPr>
-        <w:t>Brand-expandable product table with sort controls (units / revenue) and category filter.</w:t>
+        <w:t>Brand-expandable product table with sort and category filter controls.</w:t>
       </w:r>
     </w:p>
     <w:p>
@@ -3438,7 +2741,7 @@
           <w:color w:val="444444"/>
           <w:sz w:val="21"/>
         </w:rPr>
-        <w:t>Stock reconciliation table with a popover count-entry UX — clicking a closing balance cell opens an input with a notes field; saving triggers a flash confirmation.</w:t>
+        <w:t>Stock reconciliation table with popover count-entry: click a cell, enter a quantity, add a note, save — triggers a flash confirmation and chains the count to the following week's opening balance.</w:t>
       </w:r>
     </w:p>
     <w:p>
@@ -3452,7 +2755,7 @@
           <w:color w:val="444444"/>
           <w:sz w:val="21"/>
         </w:rPr>
-        <w:t>Opening balance chaining from the previous week's closing count.</w:t>
+        <w:t>Finance tab: line chart with per-category legend toggles; GP table with month picker.</w:t>
       </w:r>
     </w:p>
     <w:p>
@@ -3466,21 +2769,7 @@
           <w:color w:val="444444"/>
           <w:sz w:val="21"/>
         </w:rPr>
-        <w:t>Finance tab: interactive line chart with per-category legend toggles, and a month-picker GP table.</w:t>
-      </w:r>
-    </w:p>
-    <w:p>
-      <w:pPr>
-        <w:pStyle w:val="ListBullet"/>
-        <w:spacing w:after="60"/>
-        <w:ind w:left="340"/>
-      </w:pPr>
-      <w:r>
-        <w:rPr>
-          <w:color w:val="444444"/>
-          <w:sz w:val="21"/>
-        </w:rPr>
-        <w:t>Order Prediction: covers bar, urgency flags, status filter, and Order button per row.</w:t>
+        <w:t>Order Prediction: covers bar, urgency flags, status filter, Order button per product row.</w:t>
       </w:r>
     </w:p>
     <w:p>
@@ -3493,7 +2782,7 @@
           <w:color w:val="111111"/>
           <w:sz w:val="26"/>
         </w:rPr>
-        <w:t>Audit Findings and Revisions</w:t>
+        <w:t>Audit and Revisions</w:t>
       </w:r>
     </w:p>
     <w:p>
@@ -3505,19 +2794,7 @@
           <w:color w:val="444444"/>
           <w:sz w:val="21"/>
         </w:rPr>
-        <w:t>Iteration 2 was formally audited against the benchmark criteria. The audit identified four high-priority issues and four medium-priority issues.</w:t>
-      </w:r>
-    </w:p>
-    <w:p>
-      <w:pPr>
-        <w:spacing w:after="120"/>
-      </w:pPr>
-      <w:r>
-        <w:rPr>
-          <w:color w:val="444444"/>
-          <w:sz w:val="21"/>
-        </w:rPr>
-        <w:t>High-priority issues addressed in the revised prototype:</w:t>
+        <w:t>The structure prototype was formally audited against the benchmark metrics and the stated objective. Four high-priority issues were identified and resolved before the prototype was signed off.</w:t>
       </w:r>
     </w:p>
     <w:p>
@@ -3539,7 +2816,7 @@
           <w:color w:val="444444"/>
           <w:sz w:val="21"/>
         </w:rPr>
-        <w:t>The prototype had Order Prediction at position 2 and Stock Reconciliation at position 3, reversing the intended flow. Corrected to: Weekly Report → Stock Reconciliation → Order Prediction → Finance.</w:t>
+        <w:t>Stock Reconciliation was at position 3, Order Prediction at position 2 — reversing the intended flow (stock reality should inform reorder decisions). Corrected.</w:t>
       </w:r>
     </w:p>
     <w:p>
@@ -3554,14 +2831,14 @@
           <w:color w:val="111111"/>
           <w:sz w:val="21"/>
         </w:rPr>
-        <w:t xml:space="preserve">Days Left column missing from Weekly Report. </w:t>
+        <w:t xml:space="preserve">Days Left not visible on the default screen. </w:t>
       </w:r>
       <w:r>
         <w:rPr>
           <w:color w:val="444444"/>
           <w:sz w:val="21"/>
         </w:rPr>
-        <w:t>The covers calculation existed in Order Prediction but was not visible on the default tab. Added as a colour-coded pill column in the product table.</w:t>
+        <w:t>Days of stock remaining was only shown inside Order Prediction. Added as a colour-coded column in the Weekly Report product table so it is visible without navigating away.</w:t>
       </w:r>
     </w:p>
     <w:p>
@@ -3583,7 +2860,7 @@
           <w:color w:val="444444"/>
           <w:sz w:val="21"/>
         </w:rPr>
-        <w:t>Order Now / Order Soon counts required navigating to a separate tab. Added as a four-badge health strip above the KPI cards, with click-through links to Order Prediction filtered by status.</w:t>
+        <w:t>Order Now / Order Soon counts required a tab switch. Added as a four-badge health strip above the KPI cards, with each badge linking directly to Order Prediction filtered to that status.</w:t>
       </w:r>
     </w:p>
     <w:p>
@@ -3598,14 +2875,14 @@
           <w:color w:val="111111"/>
           <w:sz w:val="21"/>
         </w:rPr>
-        <w:t xml:space="preserve">Monthly variance summary absent from Stock Reconciliation. </w:t>
+        <w:t xml:space="preserve">Monthly variance summary missing. </w:t>
       </w:r>
       <w:r>
         <w:rPr>
           <w:color w:val="444444"/>
           <w:sz w:val="21"/>
         </w:rPr>
-        <w:t>Variance was calculable per week but not aggregated by month. Added a summary table below the weekly reconciliation table, aggregating all weeks with entered counts.</w:t>
+        <w:t>Stock Reconciliation showed variance per week but not aggregated by month. Added a summary table below the weekly view, covering all months with entered counts.</w:t>
       </w:r>
     </w:p>
     <w:p>
@@ -3617,7 +2894,7 @@
           <w:color w:val="444444"/>
           <w:sz w:val="21"/>
         </w:rPr>
-        <w:t>Medium-priority issues identified but not yet implemented:</w:t>
+        <w:t>Items identified but deferred to the next iteration:</w:t>
       </w:r>
     </w:p>
     <w:p>
@@ -3631,7 +2908,7 @@
           <w:color w:val="444444"/>
           <w:sz w:val="21"/>
         </w:rPr>
-        <w:t>Sell-through rate not calculated — requires units sold ÷ (delivered + opening stock).</w:t>
+        <w:t>Sell-through rate (units sold ÷ delivered + opening stock) — not yet calculated.</w:t>
       </w:r>
     </w:p>
     <w:p>
@@ -3645,7 +2922,7 @@
           <w:color w:val="444444"/>
           <w:sz w:val="21"/>
         </w:rPr>
-        <w:t>No overstocked / excess flag in Order Prediction for products with more than 28 days cover (café) or 84 days cover (merch).</w:t>
+        <w:t>Overstocked / excess flag in Order Prediction for products above cycle-length thresholds.</w:t>
       </w:r>
     </w:p>
     <w:p>
@@ -3659,7 +2936,7 @@
           <w:color w:val="444444"/>
           <w:sz w:val="21"/>
         </w:rPr>
-        <w:t>No total-week revenue headline above the category KPI cards.</w:t>
+        <w:t>Total-week revenue headline above the category KPI cards.</w:t>
       </w:r>
     </w:p>
     <w:p>
@@ -3673,7 +2950,7 @@
           <w:color w:val="444444"/>
           <w:sz w:val="21"/>
         </w:rPr>
-        <w:t>Merch variant grouping (size, colourway) not demonstrated — data exists in the live system.</w:t>
+        <w:t>Merch variant grouping (size, colourway) in the product table.</w:t>
       </w:r>
     </w:p>
     <w:p/>
@@ -3704,7 +2981,7 @@
           <w:color w:val="444444"/>
           <w:sz w:val="22"/>
         </w:rPr>
-        <w:t>Weekly navigation rather than a rolling-period selector</w:t>
+        <w:t>Week-by-week navigation, not a rolling-period selector</w:t>
       </w:r>
     </w:p>
     <w:p>
@@ -3716,7 +2993,7 @@
           <w:color w:val="444444"/>
           <w:sz w:val="21"/>
         </w:rPr>
-        <w:t>The original dashboard used a rolling-period control (4 / 8 / 12 weeks or a specific month). The redesign replaces this on the primary tab with a direct week-by-week navigator. The rationale: the most common operational question is about a specific week, not a rolling average. The Finance tab retains period selection for trend analysis.</w:t>
+        <w:t>The original dashboard had a rolling-period control (4 / 8 / 12 weeks, or a month). The redesign replaces this on the primary tab with direct week navigation. The most common operational question is about a specific week, not an average period. Rolling-period analysis belongs on the Finance tab.</w:t>
       </w:r>
     </w:p>
     <w:p>
@@ -3729,7 +3006,7 @@
           <w:color w:val="444444"/>
           <w:sz w:val="22"/>
         </w:rPr>
-        <w:t>Stock health as count badges, not a bar chart</w:t>
+        <w:t>Stock health as count badges, not a chart</w:t>
       </w:r>
     </w:p>
     <w:p>
@@ -3741,7 +3018,7 @@
           <w:color w:val="444444"/>
           <w:sz w:val="21"/>
         </w:rPr>
-        <w:t>A bar chart was considered for the stock health panel. Count badges were chosen instead because stock health is categorical (three or four states), not continuous. Badges communicate the urgency directly and double as navigation shortcuts.</w:t>
+        <w:t>A bar chart was considered for the stock health panel. Badges were chosen because stock health status is categorical — a product is either low, healthy, or excess — not a continuous value that benefits from a chart axis. The badges also serve as direct navigation shortcuts to the filtered Order Prediction view.</w:t>
       </w:r>
     </w:p>
     <w:p>
@@ -3754,7 +3031,7 @@
           <w:color w:val="444444"/>
           <w:sz w:val="22"/>
         </w:rPr>
-        <w:t>Monthly cadence for stock reconciliation</w:t>
+        <w:t>Monthly physical count cadence</w:t>
       </w:r>
     </w:p>
     <w:p>
@@ -3766,7 +3043,7 @@
           <w:color w:val="444444"/>
           <w:sz w:val="21"/>
         </w:rPr>
-        <w:t>A weekly stock count cadence was considered impractical. The design allows closing counts to be entered for any week at any time, with the monthly variance summary aggregating only weeks where counts were actually recorded. This accommodates infrequent physical counts without breaking the chain.</w:t>
+        <w:t>Daily or weekly counts are not practical for this business. The design accommodates this by allowing counts to be entered for any week at any time, with the monthly variance summary only aggregating weeks where a count was actually recorded. The theoretical stock estimate remains available in all other weeks.</w:t>
       </w:r>
     </w:p>
     <w:p>
@@ -3779,7 +3056,7 @@
           <w:color w:val="444444"/>
           <w:sz w:val="22"/>
         </w:rPr>
-        <w:t>Order Prediction unchanged</w:t>
+        <w:t>Order Prediction carried over unchanged</w:t>
       </w:r>
     </w:p>
     <w:p>
@@ -3791,7 +3068,7 @@
           <w:color w:val="444444"/>
           <w:sz w:val="21"/>
         </w:rPr>
-        <w:t>The reorder engine was identified as the strongest component of the original design and required no structural changes. Rewriting it would have introduced risk with no benefit.</w:t>
+        <w:t>The velocity and reorder engine was the strongest part of the original design — correctly modelled, well-executed, and already trusted by the team. The only change was correcting its position to tab 3 so that Stock Reconciliation (the stock reality check) precedes it logically.</w:t>
       </w:r>
     </w:p>
     <w:p>
@@ -3804,7 +3081,7 @@
           <w:color w:val="444444"/>
           <w:sz w:val="22"/>
         </w:rPr>
-        <w:t>Café and merch in separate segments, not separate tabs</w:t>
+        <w:t>Café and merch as segment toggles, not separate tabs</w:t>
       </w:r>
     </w:p>
     <w:p>
@@ -3816,7 +3093,7 @@
           <w:color w:val="444444"/>
           <w:sz w:val="21"/>
         </w:rPr>
-        <w:t>Earlier designs had separate tabs for café and merch. The redesign uses a Café / Merch toggle within each tab. The rationale: the manager reviewing stock health cares about the overall picture first; the segment split is a filter, not a destination.</w:t>
+        <w:t>Earlier iterations had separate tabs for each product area. The redesign uses a toggle within each tab. The overall stock health picture matters first; the café/merch breakdown is a filter applied on top of it.</w:t>
       </w:r>
     </w:p>
     <w:p>
@@ -3829,7 +3106,7 @@
           <w:color w:val="444444"/>
           <w:sz w:val="22"/>
         </w:rPr>
-        <w:t>Excluding in-house products from reconciliation</w:t>
+        <w:t>In-house products excluded from stock tracking</w:t>
       </w:r>
     </w:p>
     <w:p>
@@ -3841,7 +3118,7 @@
           <w:color w:val="444444"/>
           <w:sz w:val="21"/>
         </w:rPr>
-        <w:t>Coffee, house-made shakes, and services are excluded from the Stock Reconciliation tab for the same reason they are excluded from Order Prediction: they are not stocked products. This keeps the tab focused on items that are actually ordered and received from suppliers.</w:t>
+        <w:t>Coffee and house-made shakes are not purchased stock — they are prepared in-house from consumables. Tracking them as inventory units would produce meaningless reorder suggestions. The exclusion logic from Order Prediction is applied consistently to Stock Reconciliation.</w:t>
       </w:r>
     </w:p>
     <w:p/>
@@ -3859,798 +3136,7 @@
           <w:color w:val="888888"/>
           <w:sz w:val="20"/>
         </w:rPr>
-        <w:t>8. COMPARISON AGAINST COMMERCIAL TOOLS</w:t>
-      </w:r>
-    </w:p>
-    <w:p>
-      <w:pPr>
-        <w:spacing w:after="120"/>
-      </w:pPr>
-      <w:r>
-        <w:rPr>
-          <w:color w:val="444444"/>
-          <w:sz w:val="21"/>
-        </w:rPr>
-        <w:t>The redesigned dashboard was assessed against the capabilities of entry-level commercial inventory management tools (Lightspeed Retail, Square for Retail, Vend).</w:t>
-      </w:r>
-    </w:p>
-    <w:tbl>
-      <w:tblPr>
-        <w:tblStyle w:val="TableGrid"/>
-        <w:tblW w:type="auto" w:w="0"/>
-        <w:jc w:val="left"/>
-        <w:tblLook w:firstColumn="1" w:firstRow="1" w:lastColumn="0" w:lastRow="0" w:noHBand="0" w:noVBand="1" w:val="04A0"/>
-      </w:tblPr>
-      <w:tblGrid>
-        <w:gridCol w:w="3041"/>
-        <w:gridCol w:w="3041"/>
-        <w:gridCol w:w="3041"/>
-      </w:tblGrid>
-      <w:tr>
-        <w:tc>
-          <w:tcPr>
-            <w:tcW w:type="dxa" w:w="4819"/>
-            <w:shd w:val="clear" w:color="auto" w:fill="111111"/>
-          </w:tcPr>
-          <w:p>
-            <w:pPr>
-              <w:spacing w:before="80" w:after="80"/>
-            </w:pPr>
-            <w:r>
-              <w:rPr>
-                <w:b/>
-                <w:color w:val="FFFFFF"/>
-                <w:sz w:val="18"/>
-              </w:rPr>
-              <w:t>CAPABILITY</w:t>
-            </w:r>
-          </w:p>
-        </w:tc>
-        <w:tc>
-          <w:tcPr>
-            <w:tcW w:type="dxa" w:w="1417"/>
-            <w:shd w:val="clear" w:color="auto" w:fill="111111"/>
-          </w:tcPr>
-          <w:p>
-            <w:pPr>
-              <w:spacing w:before="80" w:after="80"/>
-            </w:pPr>
-            <w:r>
-              <w:rPr>
-                <w:b/>
-                <w:color w:val="FFFFFF"/>
-                <w:sz w:val="18"/>
-              </w:rPr>
-              <w:t>COMMERCIAL</w:t>
-            </w:r>
-          </w:p>
-        </w:tc>
-        <w:tc>
-          <w:tcPr>
-            <w:tcW w:type="dxa" w:w="2835"/>
-            <w:shd w:val="clear" w:color="auto" w:fill="111111"/>
-          </w:tcPr>
-          <w:p>
-            <w:pPr>
-              <w:spacing w:before="80" w:after="80"/>
-            </w:pPr>
-            <w:r>
-              <w:rPr>
-                <w:b/>
-                <w:color w:val="FFFFFF"/>
-                <w:sz w:val="18"/>
-              </w:rPr>
-              <w:t>THIS DASHBOARD</w:t>
-            </w:r>
-          </w:p>
-        </w:tc>
-      </w:tr>
-      <w:tr>
-        <w:tc>
-          <w:tcPr>
-            <w:tcW w:type="dxa" w:w="4819"/>
-            <w:shd w:val="clear" w:color="auto" w:fill="FFFFFF"/>
-          </w:tcPr>
-          <w:p>
-            <w:pPr>
-              <w:spacing w:before="60" w:after="60"/>
-            </w:pPr>
-            <w:r>
-              <w:rPr>
-                <w:color w:val="444444"/>
-                <w:sz w:val="19"/>
-              </w:rPr>
-              <w:t>Velocity-based reorder prediction</w:t>
-            </w:r>
-          </w:p>
-        </w:tc>
-        <w:tc>
-          <w:tcPr>
-            <w:tcW w:type="dxa" w:w="1417"/>
-            <w:shd w:val="clear" w:color="auto" w:fill="FFFFFF"/>
-          </w:tcPr>
-          <w:p>
-            <w:pPr>
-              <w:spacing w:before="60" w:after="60"/>
-            </w:pPr>
-            <w:r>
-              <w:rPr>
-                <w:color w:val="444444"/>
-                <w:sz w:val="19"/>
-              </w:rPr>
-              <w:t>✓</w:t>
-            </w:r>
-          </w:p>
-        </w:tc>
-        <w:tc>
-          <w:tcPr>
-            <w:tcW w:type="dxa" w:w="2835"/>
-            <w:shd w:val="clear" w:color="auto" w:fill="FFFFFF"/>
-          </w:tcPr>
-          <w:p>
-            <w:pPr>
-              <w:spacing w:before="60" w:after="60"/>
-            </w:pPr>
-            <w:r>
-              <w:rPr>
-                <w:color w:val="444444"/>
-                <w:sz w:val="19"/>
-              </w:rPr>
-              <w:t>✓</w:t>
-            </w:r>
-          </w:p>
-        </w:tc>
-      </w:tr>
-      <w:tr>
-        <w:tc>
-          <w:tcPr>
-            <w:tcW w:type="dxa" w:w="4819"/>
-            <w:shd w:val="clear" w:color="auto" w:fill="F7F7F7"/>
-          </w:tcPr>
-          <w:p>
-            <w:pPr>
-              <w:spacing w:before="60" w:after="60"/>
-            </w:pPr>
-            <w:r>
-              <w:rPr>
-                <w:color w:val="444444"/>
-                <w:sz w:val="19"/>
-              </w:rPr>
-              <w:t>Visual stock coverage indicator</w:t>
-            </w:r>
-          </w:p>
-        </w:tc>
-        <w:tc>
-          <w:tcPr>
-            <w:tcW w:type="dxa" w:w="1417"/>
-            <w:shd w:val="clear" w:color="auto" w:fill="F7F7F7"/>
-          </w:tcPr>
-          <w:p>
-            <w:pPr>
-              <w:spacing w:before="60" w:after="60"/>
-            </w:pPr>
-            <w:r>
-              <w:rPr>
-                <w:color w:val="444444"/>
-                <w:sz w:val="19"/>
-              </w:rPr>
-              <w:t>✓</w:t>
-            </w:r>
-          </w:p>
-        </w:tc>
-        <w:tc>
-          <w:tcPr>
-            <w:tcW w:type="dxa" w:w="2835"/>
-            <w:shd w:val="clear" w:color="auto" w:fill="F7F7F7"/>
-          </w:tcPr>
-          <w:p>
-            <w:pPr>
-              <w:spacing w:before="60" w:after="60"/>
-            </w:pPr>
-            <w:r>
-              <w:rPr>
-                <w:color w:val="444444"/>
-                <w:sz w:val="19"/>
-              </w:rPr>
-              <w:t>✓</w:t>
-            </w:r>
-          </w:p>
-        </w:tc>
-      </w:tr>
-      <w:tr>
-        <w:tc>
-          <w:tcPr>
-            <w:tcW w:type="dxa" w:w="4819"/>
-            <w:shd w:val="clear" w:color="auto" w:fill="FFFFFF"/>
-          </w:tcPr>
-          <w:p>
-            <w:pPr>
-              <w:spacing w:before="60" w:after="60"/>
-            </w:pPr>
-            <w:r>
-              <w:rPr>
-                <w:color w:val="444444"/>
-                <w:sz w:val="19"/>
-              </w:rPr>
-              <w:t>Physical stock count workflow</w:t>
-            </w:r>
-          </w:p>
-        </w:tc>
-        <w:tc>
-          <w:tcPr>
-            <w:tcW w:type="dxa" w:w="1417"/>
-            <w:shd w:val="clear" w:color="auto" w:fill="FFFFFF"/>
-          </w:tcPr>
-          <w:p>
-            <w:pPr>
-              <w:spacing w:before="60" w:after="60"/>
-            </w:pPr>
-            <w:r>
-              <w:rPr>
-                <w:color w:val="444444"/>
-                <w:sz w:val="19"/>
-              </w:rPr>
-              <w:t>✓</w:t>
-            </w:r>
-          </w:p>
-        </w:tc>
-        <w:tc>
-          <w:tcPr>
-            <w:tcW w:type="dxa" w:w="2835"/>
-            <w:shd w:val="clear" w:color="auto" w:fill="FFFFFF"/>
-          </w:tcPr>
-          <w:p>
-            <w:pPr>
-              <w:spacing w:before="60" w:after="60"/>
-            </w:pPr>
-            <w:r>
-              <w:rPr>
-                <w:color w:val="444444"/>
-                <w:sz w:val="19"/>
-              </w:rPr>
-              <w:t>✓ (new tab)</w:t>
-            </w:r>
-          </w:p>
-        </w:tc>
-      </w:tr>
-      <w:tr>
-        <w:tc>
-          <w:tcPr>
-            <w:tcW w:type="dxa" w:w="4819"/>
-            <w:shd w:val="clear" w:color="auto" w:fill="F7F7F7"/>
-          </w:tcPr>
-          <w:p>
-            <w:pPr>
-              <w:spacing w:before="60" w:after="60"/>
-            </w:pPr>
-            <w:r>
-              <w:rPr>
-                <w:color w:val="444444"/>
-                <w:sz w:val="19"/>
-              </w:rPr>
-              <w:t>Gross profit % by product</w:t>
-            </w:r>
-          </w:p>
-        </w:tc>
-        <w:tc>
-          <w:tcPr>
-            <w:tcW w:type="dxa" w:w="1417"/>
-            <w:shd w:val="clear" w:color="auto" w:fill="F7F7F7"/>
-          </w:tcPr>
-          <w:p>
-            <w:pPr>
-              <w:spacing w:before="60" w:after="60"/>
-            </w:pPr>
-            <w:r>
-              <w:rPr>
-                <w:color w:val="444444"/>
-                <w:sz w:val="19"/>
-              </w:rPr>
-              <w:t>✓</w:t>
-            </w:r>
-          </w:p>
-        </w:tc>
-        <w:tc>
-          <w:tcPr>
-            <w:tcW w:type="dxa" w:w="2835"/>
-            <w:shd w:val="clear" w:color="auto" w:fill="F7F7F7"/>
-          </w:tcPr>
-          <w:p>
-            <w:pPr>
-              <w:spacing w:before="60" w:after="60"/>
-            </w:pPr>
-            <w:r>
-              <w:rPr>
-                <w:color w:val="444444"/>
-                <w:sz w:val="19"/>
-              </w:rPr>
-              <w:t>✓ (data-dependent)</w:t>
-            </w:r>
-          </w:p>
-        </w:tc>
-      </w:tr>
-      <w:tr>
-        <w:tc>
-          <w:tcPr>
-            <w:tcW w:type="dxa" w:w="4819"/>
-            <w:shd w:val="clear" w:color="auto" w:fill="FFFFFF"/>
-          </w:tcPr>
-          <w:p>
-            <w:pPr>
-              <w:spacing w:before="60" w:after="60"/>
-            </w:pPr>
-            <w:r>
-              <w:rPr>
-                <w:color w:val="444444"/>
-                <w:sz w:val="19"/>
-              </w:rPr>
-              <w:t>Revenue trend chart by category</w:t>
-            </w:r>
-          </w:p>
-        </w:tc>
-        <w:tc>
-          <w:tcPr>
-            <w:tcW w:type="dxa" w:w="1417"/>
-            <w:shd w:val="clear" w:color="auto" w:fill="FFFFFF"/>
-          </w:tcPr>
-          <w:p>
-            <w:pPr>
-              <w:spacing w:before="60" w:after="60"/>
-            </w:pPr>
-            <w:r>
-              <w:rPr>
-                <w:color w:val="444444"/>
-                <w:sz w:val="19"/>
-              </w:rPr>
-              <w:t>✓</w:t>
-            </w:r>
-          </w:p>
-        </w:tc>
-        <w:tc>
-          <w:tcPr>
-            <w:tcW w:type="dxa" w:w="2835"/>
-            <w:shd w:val="clear" w:color="auto" w:fill="FFFFFF"/>
-          </w:tcPr>
-          <w:p>
-            <w:pPr>
-              <w:spacing w:before="60" w:after="60"/>
-            </w:pPr>
-            <w:r>
-              <w:rPr>
-                <w:color w:val="444444"/>
-                <w:sz w:val="19"/>
-              </w:rPr>
-              <w:t>✓</w:t>
-            </w:r>
-          </w:p>
-        </w:tc>
-      </w:tr>
-      <w:tr>
-        <w:tc>
-          <w:tcPr>
-            <w:tcW w:type="dxa" w:w="4819"/>
-            <w:shd w:val="clear" w:color="auto" w:fill="F7F7F7"/>
-          </w:tcPr>
-          <w:p>
-            <w:pPr>
-              <w:spacing w:before="60" w:after="60"/>
-            </w:pPr>
-            <w:r>
-              <w:rPr>
-                <w:color w:val="444444"/>
-                <w:sz w:val="19"/>
-              </w:rPr>
-              <w:t>Sell-through rate</w:t>
-            </w:r>
-          </w:p>
-        </w:tc>
-        <w:tc>
-          <w:tcPr>
-            <w:tcW w:type="dxa" w:w="1417"/>
-            <w:shd w:val="clear" w:color="auto" w:fill="F7F7F7"/>
-          </w:tcPr>
-          <w:p>
-            <w:pPr>
-              <w:spacing w:before="60" w:after="60"/>
-            </w:pPr>
-            <w:r>
-              <w:rPr>
-                <w:color w:val="444444"/>
-                <w:sz w:val="19"/>
-              </w:rPr>
-              <w:t>✓</w:t>
-            </w:r>
-          </w:p>
-        </w:tc>
-        <w:tc>
-          <w:tcPr>
-            <w:tcW w:type="dxa" w:w="2835"/>
-            <w:shd w:val="clear" w:color="auto" w:fill="F7F7F7"/>
-          </w:tcPr>
-          <w:p>
-            <w:pPr>
-              <w:spacing w:before="60" w:after="60"/>
-            </w:pPr>
-            <w:r>
-              <w:rPr>
-                <w:color w:val="444444"/>
-                <w:sz w:val="19"/>
-              </w:rPr>
-              <w:t>✗ (planned)</w:t>
-            </w:r>
-          </w:p>
-        </w:tc>
-      </w:tr>
-      <w:tr>
-        <w:tc>
-          <w:tcPr>
-            <w:tcW w:type="dxa" w:w="4819"/>
-            <w:shd w:val="clear" w:color="auto" w:fill="FFFFFF"/>
-          </w:tcPr>
-          <w:p>
-            <w:pPr>
-              <w:spacing w:before="60" w:after="60"/>
-            </w:pPr>
-            <w:r>
-              <w:rPr>
-                <w:color w:val="444444"/>
-                <w:sz w:val="19"/>
-              </w:rPr>
-              <w:t>Overstocked / excess flag</w:t>
-            </w:r>
-          </w:p>
-        </w:tc>
-        <w:tc>
-          <w:tcPr>
-            <w:tcW w:type="dxa" w:w="1417"/>
-            <w:shd w:val="clear" w:color="auto" w:fill="FFFFFF"/>
-          </w:tcPr>
-          <w:p>
-            <w:pPr>
-              <w:spacing w:before="60" w:after="60"/>
-            </w:pPr>
-            <w:r>
-              <w:rPr>
-                <w:color w:val="444444"/>
-                <w:sz w:val="19"/>
-              </w:rPr>
-              <w:t>✓</w:t>
-            </w:r>
-          </w:p>
-        </w:tc>
-        <w:tc>
-          <w:tcPr>
-            <w:tcW w:type="dxa" w:w="2835"/>
-            <w:shd w:val="clear" w:color="auto" w:fill="FFFFFF"/>
-          </w:tcPr>
-          <w:p>
-            <w:pPr>
-              <w:spacing w:before="60" w:after="60"/>
-            </w:pPr>
-            <w:r>
-              <w:rPr>
-                <w:color w:val="444444"/>
-                <w:sz w:val="19"/>
-              </w:rPr>
-              <w:t>✗ (planned)</w:t>
-            </w:r>
-          </w:p>
-        </w:tc>
-      </w:tr>
-      <w:tr>
-        <w:tc>
-          <w:tcPr>
-            <w:tcW w:type="dxa" w:w="4819"/>
-            <w:shd w:val="clear" w:color="auto" w:fill="F7F7F7"/>
-          </w:tcPr>
-          <w:p>
-            <w:pPr>
-              <w:spacing w:before="60" w:after="60"/>
-            </w:pPr>
-            <w:r>
-              <w:rPr>
-                <w:color w:val="444444"/>
-                <w:sz w:val="19"/>
-              </w:rPr>
-              <w:t>Real-time stock deduction on sale</w:t>
-            </w:r>
-          </w:p>
-        </w:tc>
-        <w:tc>
-          <w:tcPr>
-            <w:tcW w:type="dxa" w:w="1417"/>
-            <w:shd w:val="clear" w:color="auto" w:fill="F7F7F7"/>
-          </w:tcPr>
-          <w:p>
-            <w:pPr>
-              <w:spacing w:before="60" w:after="60"/>
-            </w:pPr>
-            <w:r>
-              <w:rPr>
-                <w:color w:val="444444"/>
-                <w:sz w:val="19"/>
-              </w:rPr>
-              <w:t>✓</w:t>
-            </w:r>
-          </w:p>
-        </w:tc>
-        <w:tc>
-          <w:tcPr>
-            <w:tcW w:type="dxa" w:w="2835"/>
-            <w:shd w:val="clear" w:color="auto" w:fill="F7F7F7"/>
-          </w:tcPr>
-          <w:p>
-            <w:pPr>
-              <w:spacing w:before="60" w:after="60"/>
-            </w:pPr>
-            <w:r>
-              <w:rPr>
-                <w:color w:val="444444"/>
-                <w:sz w:val="19"/>
-              </w:rPr>
-              <w:t>✗ (CSV lag — by design)</w:t>
-            </w:r>
-          </w:p>
-        </w:tc>
-      </w:tr>
-      <w:tr>
-        <w:tc>
-          <w:tcPr>
-            <w:tcW w:type="dxa" w:w="4819"/>
-            <w:shd w:val="clear" w:color="auto" w:fill="FFFFFF"/>
-          </w:tcPr>
-          <w:p>
-            <w:pPr>
-              <w:spacing w:before="60" w:after="60"/>
-            </w:pPr>
-            <w:r>
-              <w:rPr>
-                <w:color w:val="444444"/>
-                <w:sz w:val="19"/>
-              </w:rPr>
-              <w:t>Automated purchase order generation</w:t>
-            </w:r>
-          </w:p>
-        </w:tc>
-        <w:tc>
-          <w:tcPr>
-            <w:tcW w:type="dxa" w:w="1417"/>
-            <w:shd w:val="clear" w:color="auto" w:fill="FFFFFF"/>
-          </w:tcPr>
-          <w:p>
-            <w:pPr>
-              <w:spacing w:before="60" w:after="60"/>
-            </w:pPr>
-            <w:r>
-              <w:rPr>
-                <w:color w:val="444444"/>
-                <w:sz w:val="19"/>
-              </w:rPr>
-              <w:t>✓</w:t>
-            </w:r>
-          </w:p>
-        </w:tc>
-        <w:tc>
-          <w:tcPr>
-            <w:tcW w:type="dxa" w:w="2835"/>
-            <w:shd w:val="clear" w:color="auto" w:fill="FFFFFF"/>
-          </w:tcPr>
-          <w:p>
-            <w:pPr>
-              <w:spacing w:before="60" w:after="60"/>
-            </w:pPr>
-            <w:r>
-              <w:rPr>
-                <w:color w:val="444444"/>
-                <w:sz w:val="19"/>
-              </w:rPr>
-              <w:t>✗</w:t>
-            </w:r>
-          </w:p>
-        </w:tc>
-      </w:tr>
-      <w:tr>
-        <w:tc>
-          <w:tcPr>
-            <w:tcW w:type="dxa" w:w="4819"/>
-            <w:shd w:val="clear" w:color="auto" w:fill="F7F7F7"/>
-          </w:tcPr>
-          <w:p>
-            <w:pPr>
-              <w:spacing w:before="60" w:after="60"/>
-            </w:pPr>
-            <w:r>
-              <w:rPr>
-                <w:color w:val="444444"/>
-                <w:sz w:val="19"/>
-              </w:rPr>
-              <w:t>Dual café / merch cycle-time logic</w:t>
-            </w:r>
-          </w:p>
-        </w:tc>
-        <w:tc>
-          <w:tcPr>
-            <w:tcW w:type="dxa" w:w="1417"/>
-            <w:shd w:val="clear" w:color="auto" w:fill="F7F7F7"/>
-          </w:tcPr>
-          <w:p>
-            <w:pPr>
-              <w:spacing w:before="60" w:after="60"/>
-            </w:pPr>
-            <w:r>
-              <w:rPr>
-                <w:color w:val="444444"/>
-                <w:sz w:val="19"/>
-              </w:rPr>
-              <w:t>✗</w:t>
-            </w:r>
-          </w:p>
-        </w:tc>
-        <w:tc>
-          <w:tcPr>
-            <w:tcW w:type="dxa" w:w="2835"/>
-            <w:shd w:val="clear" w:color="auto" w:fill="F7F7F7"/>
-          </w:tcPr>
-          <w:p>
-            <w:pPr>
-              <w:spacing w:before="60" w:after="60"/>
-            </w:pPr>
-            <w:r>
-              <w:rPr>
-                <w:color w:val="444444"/>
-                <w:sz w:val="19"/>
-              </w:rPr>
-              <w:t>✓ (custom)</w:t>
-            </w:r>
-          </w:p>
-        </w:tc>
-      </w:tr>
-      <w:tr>
-        <w:tc>
-          <w:tcPr>
-            <w:tcW w:type="dxa" w:w="4819"/>
-            <w:shd w:val="clear" w:color="auto" w:fill="FFFFFF"/>
-          </w:tcPr>
-          <w:p>
-            <w:pPr>
-              <w:spacing w:before="60" w:after="60"/>
-            </w:pPr>
-            <w:r>
-              <w:rPr>
-                <w:color w:val="444444"/>
-                <w:sz w:val="19"/>
-              </w:rPr>
-              <w:t>PDF invoice parsing for deliveries</w:t>
-            </w:r>
-          </w:p>
-        </w:tc>
-        <w:tc>
-          <w:tcPr>
-            <w:tcW w:type="dxa" w:w="1417"/>
-            <w:shd w:val="clear" w:color="auto" w:fill="FFFFFF"/>
-          </w:tcPr>
-          <w:p>
-            <w:pPr>
-              <w:spacing w:before="60" w:after="60"/>
-            </w:pPr>
-            <w:r>
-              <w:rPr>
-                <w:color w:val="444444"/>
-                <w:sz w:val="19"/>
-              </w:rPr>
-              <w:t>✗</w:t>
-            </w:r>
-          </w:p>
-        </w:tc>
-        <w:tc>
-          <w:tcPr>
-            <w:tcW w:type="dxa" w:w="2835"/>
-            <w:shd w:val="clear" w:color="auto" w:fill="FFFFFF"/>
-          </w:tcPr>
-          <w:p>
-            <w:pPr>
-              <w:spacing w:before="60" w:after="60"/>
-            </w:pPr>
-            <w:r>
-              <w:rPr>
-                <w:color w:val="444444"/>
-                <w:sz w:val="19"/>
-              </w:rPr>
-              <w:t>✓ (custom)</w:t>
-            </w:r>
-          </w:p>
-        </w:tc>
-      </w:tr>
-      <w:tr>
-        <w:tc>
-          <w:tcPr>
-            <w:tcW w:type="dxa" w:w="4819"/>
-            <w:shd w:val="clear" w:color="auto" w:fill="F7F7F7"/>
-          </w:tcPr>
-          <w:p>
-            <w:pPr>
-              <w:spacing w:before="60" w:after="60"/>
-            </w:pPr>
-            <w:r>
-              <w:rPr>
-                <w:color w:val="444444"/>
-                <w:sz w:val="19"/>
-              </w:rPr>
-              <w:t>WodBoard CSV sales import</w:t>
-            </w:r>
-          </w:p>
-        </w:tc>
-        <w:tc>
-          <w:tcPr>
-            <w:tcW w:type="dxa" w:w="1417"/>
-            <w:shd w:val="clear" w:color="auto" w:fill="F7F7F7"/>
-          </w:tcPr>
-          <w:p>
-            <w:pPr>
-              <w:spacing w:before="60" w:after="60"/>
-            </w:pPr>
-            <w:r>
-              <w:rPr>
-                <w:color w:val="444444"/>
-                <w:sz w:val="19"/>
-              </w:rPr>
-              <w:t>✗</w:t>
-            </w:r>
-          </w:p>
-        </w:tc>
-        <w:tc>
-          <w:tcPr>
-            <w:tcW w:type="dxa" w:w="2835"/>
-            <w:shd w:val="clear" w:color="auto" w:fill="F7F7F7"/>
-          </w:tcPr>
-          <w:p>
-            <w:pPr>
-              <w:spacing w:before="60" w:after="60"/>
-            </w:pPr>
-            <w:r>
-              <w:rPr>
-                <w:color w:val="444444"/>
-                <w:sz w:val="19"/>
-              </w:rPr>
-              <w:t>✓ (custom)</w:t>
-            </w:r>
-          </w:p>
-        </w:tc>
-      </w:tr>
-    </w:tbl>
-    <w:p>
-      <w:pPr>
-        <w:spacing w:after="40"/>
-      </w:pPr>
-    </w:p>
-    <w:p>
-      <w:pPr>
-        <w:spacing w:after="120"/>
-      </w:pPr>
-      <w:r>
-        <w:rPr>
-          <w:color w:val="444444"/>
-          <w:sz w:val="21"/>
-        </w:rPr>
-        <w:t>The custom dashboard matches or exceeds commercial tools on the features most relevant to this business: velocity-based reordering, dual cycle-time logic, and automated invoice parsing. It is behind on sell-through rate and overstocked detection, both of which are technically straightforward additions at the next iteration.</w:t>
-      </w:r>
-    </w:p>
-    <w:p/>
-    <w:p>
-      <w:pPr>
-        <w:spacing w:before="360" w:after="160"/>
-        <w:pBdr>
-          <w:bottom w:val="single" w:sz="4" w:space="4" w:color="CCCCCC"/>
-        </w:pBdr>
-      </w:pPr>
-      <w:r>
-        <w:rPr>
-          <w:b/>
-          <w:caps/>
-          <w:color w:val="888888"/>
-          <w:sz w:val="20"/>
-        </w:rPr>
-        <w:t>9. NEXT STEPS</w:t>
+        <w:t>8. NEXT STEPS</w:t>
       </w:r>
     </w:p>
     <w:p>
@@ -4663,7 +3149,7 @@
           <w:color w:val="111111"/>
           <w:sz w:val="26"/>
         </w:rPr>
-        <w:t>Immediate — Prototype to Production</w:t>
+        <w:t>Prototype to Production</w:t>
       </w:r>
     </w:p>
     <w:p>
@@ -4677,7 +3163,7 @@
           <w:color w:val="444444"/>
           <w:sz w:val="21"/>
         </w:rPr>
-        <w:t>Implement the four-tab structure in the live index.html, migrating existing logic into the new tab functions.</w:t>
+        <w:t>Implement the four-tab structure in the live dashboard, migrating existing logic into the new tab functions.</w:t>
       </w:r>
     </w:p>
     <w:p>
@@ -4691,7 +3177,7 @@
           <w:color w:val="444444"/>
           <w:sz w:val="21"/>
         </w:rPr>
-        <w:t>Connect the Stock Reconciliation tab to the live shop_stock_takes Supabase table.</w:t>
+        <w:t>Connect Stock Reconciliation to the live shop_stock_takes Supabase table.</w:t>
       </w:r>
     </w:p>
     <w:p>
@@ -4705,7 +3191,7 @@
           <w:color w:val="444444"/>
           <w:sz w:val="21"/>
         </w:rPr>
-        <w:t>Populate cost prices in the product lookup table to unlock gross profit reporting.</w:t>
+        <w:t>Populate cost prices in the product lookup table to unlock gross profit reporting on the Finance tab.</w:t>
       </w:r>
     </w:p>
     <w:p>
@@ -4719,7 +3205,7 @@
           <w:color w:val="444444"/>
           <w:sz w:val="21"/>
         </w:rPr>
-        <w:t>Validate the reconciliation opening-balance chain with real delivery and sales data.</w:t>
+        <w:t>Validate the reconciliation opening-balance chain against real delivery and sales data.</w:t>
       </w:r>
     </w:p>
     <w:p>
@@ -4732,7 +3218,7 @@
           <w:color w:val="111111"/>
           <w:sz w:val="26"/>
         </w:rPr>
-        <w:t>Short-Term — Remaining Gaps</w:t>
+        <w:t>Short-Term</w:t>
       </w:r>
     </w:p>
     <w:p>
@@ -4746,7 +3232,7 @@
           <w:color w:val="444444"/>
           <w:sz w:val="21"/>
         </w:rPr>
-        <w:t>Add sell-through rate as a column in the Weekly Report product table.</w:t>
+        <w:t>Sell-through rate column in the Weekly Report product table.</w:t>
       </w:r>
     </w:p>
     <w:p>
@@ -4760,7 +3246,7 @@
           <w:color w:val="444444"/>
           <w:sz w:val="21"/>
         </w:rPr>
-        <w:t>Add an overstocked / excess flag to the Order Prediction table for products above 28-day (café) or 84-day (merch) cover.</w:t>
+        <w:t>Overstocked / excess flag in Order Prediction for products above cycle-length thresholds.</w:t>
       </w:r>
     </w:p>
     <w:p>
@@ -4774,7 +3260,7 @@
           <w:color w:val="444444"/>
           <w:sz w:val="21"/>
         </w:rPr>
-        <w:t>Add a total-week revenue headline above the category KPI cards on the Weekly Report.</w:t>
+        <w:t>Total-week revenue headline above the category KPI cards.</w:t>
       </w:r>
     </w:p>
     <w:p>
@@ -4788,7 +3274,7 @@
           <w:color w:val="444444"/>
           <w:sz w:val="21"/>
         </w:rPr>
-        <w:t>Define merch variant grouping (size / colourway) for the Weekly Report product table.</w:t>
+        <w:t>Merch variant grouping (size, colourway) in the Weekly Report product table.</w:t>
       </w:r>
     </w:p>
     <w:p>
@@ -4829,7 +3315,7 @@
           <w:color w:val="444444"/>
           <w:sz w:val="21"/>
         </w:rPr>
-        <w:t>Slow-movers callout: products with zero sales in the current week but positive estimated stock.</w:t>
+        <w:t>Slow-movers callout: products with zero sales this week but positive estimated stock.</w:t>
       </w:r>
     </w:p>
     <w:p>
@@ -4843,21 +3329,7 @@
           <w:color w:val="444444"/>
           <w:sz w:val="21"/>
         </w:rPr>
-        <w:t>Performance optimisation: parallelise the Supabase data loading calls on initialisation (currently sequential, making 9+ round-trips).</w:t>
-      </w:r>
-    </w:p>
-    <w:p>
-      <w:pPr>
-        <w:pStyle w:val="ListBullet"/>
-        <w:spacing w:after="60"/>
-        <w:ind w:left="340"/>
-      </w:pPr>
-      <w:r>
-        <w:rPr>
-          <w:color w:val="444444"/>
-          <w:sz w:val="21"/>
-        </w:rPr>
-        <w:t>Customer data utilisation: customer name and email are captured in shop_sales but unused.</w:t>
+        <w:t>Performance: parallelise Supabase data loading on start-up (currently 9+ sequential calls).</w:t>
       </w:r>
     </w:p>
     <w:p/>

</xml_diff>